<commit_message>
refactor: rename parameter d_val to d in solve_system_congruences for mathematical consistency
</commit_message>
<xml_diff>
--- a/lab_2/report.docx
+++ b/lab_2/report.docx
@@ -335,7 +335,7 @@
       <w:r>
         <w:fldChar w:fldCharType="separate"/>
       </w:r>
-      <w:hyperlink w:anchor="_Toc241668340" w:history="1">
+      <w:hyperlink w:anchor="_Toc241668464" w:history="1">
         <w:r>
           <w:rPr>
             <w:rStyle w:val="aff8"/>
@@ -362,7 +362,7 @@
             <w:noProof/>
             <w:webHidden/>
           </w:rPr>
-          <w:instrText xml:space="preserve"> PAGEREF _Toc241668340 \h </w:instrText>
+          <w:instrText xml:space="preserve"> PAGEREF _Toc241668464 \h </w:instrText>
         </w:r>
         <w:r>
           <w:rPr>
@@ -409,7 +409,7 @@
           <w14:ligatures w14:val="standardContextual"/>
         </w:rPr>
       </w:pPr>
-      <w:hyperlink w:anchor="_Toc241668341" w:history="1">
+      <w:hyperlink w:anchor="_Toc241668465" w:history="1">
         <w:r>
           <w:rPr>
             <w:rStyle w:val="aff8"/>
@@ -436,7 +436,7 @@
             <w:noProof/>
             <w:webHidden/>
           </w:rPr>
-          <w:instrText xml:space="preserve"> PAGEREF _Toc241668341 \h </w:instrText>
+          <w:instrText xml:space="preserve"> PAGEREF _Toc241668465 \h </w:instrText>
         </w:r>
         <w:r>
           <w:rPr>
@@ -483,7 +483,7 @@
           <w14:ligatures w14:val="standardContextual"/>
         </w:rPr>
       </w:pPr>
-      <w:hyperlink w:anchor="_Toc241668342" w:history="1">
+      <w:hyperlink w:anchor="_Toc241668466" w:history="1">
         <w:r>
           <w:rPr>
             <w:rStyle w:val="aff8"/>
@@ -510,7 +510,7 @@
             <w:noProof/>
             <w:webHidden/>
           </w:rPr>
-          <w:instrText xml:space="preserve"> PAGEREF _Toc241668342 \h </w:instrText>
+          <w:instrText xml:space="preserve"> PAGEREF _Toc241668466 \h </w:instrText>
         </w:r>
         <w:r>
           <w:rPr>
@@ -557,7 +557,7 @@
           <w14:ligatures w14:val="standardContextual"/>
         </w:rPr>
       </w:pPr>
-      <w:hyperlink w:anchor="_Toc241668343" w:history="1">
+      <w:hyperlink w:anchor="_Toc241668467" w:history="1">
         <w:r>
           <w:rPr>
             <w:rStyle w:val="aff8"/>
@@ -584,7 +584,7 @@
             <w:noProof/>
             <w:webHidden/>
           </w:rPr>
-          <w:instrText xml:space="preserve"> PAGEREF _Toc241668343 \h </w:instrText>
+          <w:instrText xml:space="preserve"> PAGEREF _Toc241668467 \h </w:instrText>
         </w:r>
         <w:r>
           <w:rPr>
@@ -631,7 +631,7 @@
           <w14:ligatures w14:val="standardContextual"/>
         </w:rPr>
       </w:pPr>
-      <w:hyperlink w:anchor="_Toc241668344" w:history="1">
+      <w:hyperlink w:anchor="_Toc241668468" w:history="1">
         <w:r>
           <w:rPr>
             <w:rStyle w:val="aff8"/>
@@ -658,7 +658,7 @@
             <w:noProof/>
             <w:webHidden/>
           </w:rPr>
-          <w:instrText xml:space="preserve"> PAGEREF _Toc241668344 \h </w:instrText>
+          <w:instrText xml:space="preserve"> PAGEREF _Toc241668468 \h </w:instrText>
         </w:r>
         <w:r>
           <w:rPr>
@@ -705,7 +705,7 @@
           <w14:ligatures w14:val="standardContextual"/>
         </w:rPr>
       </w:pPr>
-      <w:hyperlink w:anchor="_Toc241668345" w:history="1">
+      <w:hyperlink w:anchor="_Toc241668469" w:history="1">
         <w:r>
           <w:rPr>
             <w:rStyle w:val="aff8"/>
@@ -732,7 +732,7 @@
             <w:noProof/>
             <w:webHidden/>
           </w:rPr>
-          <w:instrText xml:space="preserve"> PAGEREF _Toc241668345 \h </w:instrText>
+          <w:instrText xml:space="preserve"> PAGEREF _Toc241668469 \h </w:instrText>
         </w:r>
         <w:r>
           <w:rPr>
@@ -779,7 +779,7 @@
           <w14:ligatures w14:val="standardContextual"/>
         </w:rPr>
       </w:pPr>
-      <w:hyperlink w:anchor="_Toc241668346" w:history="1">
+      <w:hyperlink w:anchor="_Toc241668470" w:history="1">
         <w:r>
           <w:rPr>
             <w:rStyle w:val="aff8"/>
@@ -806,7 +806,7 @@
             <w:noProof/>
             <w:webHidden/>
           </w:rPr>
-          <w:instrText xml:space="preserve"> PAGEREF _Toc241668346 \h </w:instrText>
+          <w:instrText xml:space="preserve"> PAGEREF _Toc241668470 \h </w:instrText>
         </w:r>
         <w:r>
           <w:rPr>
@@ -851,7 +851,7 @@
         <w:pStyle w:val="1"/>
         <w:pageBreakBefore/>
       </w:pPr>
-      <w:bookmarkStart w:id="0" w:name="_Toc241668340"/>
+      <w:bookmarkStart w:id="0" w:name="_Toc241668464"/>
       <w:r>
         <w:rPr>
           <w:rFonts w:ascii="Times New Roman" w:eastAsia="Times New Roman" w:hAnsi="Times New Roman" w:cs="Times New Roman"/>
@@ -1060,7 +1060,7 @@
         <w:pStyle w:val="1"/>
         <w:pageBreakBefore/>
       </w:pPr>
-      <w:bookmarkStart w:id="1" w:name="_Toc241668341"/>
+      <w:bookmarkStart w:id="1" w:name="_Toc241668465"/>
       <w:r>
         <w:rPr>
           <w:rFonts w:ascii="Times New Roman" w:eastAsia="Times New Roman" w:hAnsi="Times New Roman" w:cs="Times New Roman"/>
@@ -1075,7 +1075,7 @@
       <w:pPr>
         <w:pStyle w:val="21"/>
       </w:pPr>
-      <w:bookmarkStart w:id="2" w:name="_Toc241668342"/>
+      <w:bookmarkStart w:id="2" w:name="_Toc241668466"/>
       <w:r>
         <w:rPr>
           <w:rFonts w:ascii="Times New Roman" w:eastAsia="Times New Roman" w:hAnsi="Times New Roman" w:cs="Times New Roman"/>
@@ -5455,7 +5455,7 @@
       <w:pPr>
         <w:pStyle w:val="21"/>
       </w:pPr>
-      <w:bookmarkStart w:id="3" w:name="_Toc241668343"/>
+      <w:bookmarkStart w:id="3" w:name="_Toc241668467"/>
       <w:r>
         <w:rPr>
           <w:rFonts w:ascii="Times New Roman" w:eastAsia="Times New Roman" w:hAnsi="Times New Roman" w:cs="Times New Roman"/>
@@ -11998,7 +11998,7 @@
       <w:pPr>
         <w:pStyle w:val="21"/>
       </w:pPr>
-      <w:bookmarkStart w:id="4" w:name="_Toc241668344"/>
+      <w:bookmarkStart w:id="4" w:name="_Toc241668468"/>
       <w:r>
         <w:rPr>
           <w:rFonts w:ascii="Times New Roman" w:eastAsia="Times New Roman" w:hAnsi="Times New Roman" w:cs="Times New Roman"/>
@@ -15121,7 +15121,7 @@
         <w:pStyle w:val="1"/>
         <w:pageBreakBefore/>
       </w:pPr>
-      <w:bookmarkStart w:id="5" w:name="_Toc241668345"/>
+      <w:bookmarkStart w:id="5" w:name="_Toc241668469"/>
       <w:r>
         <w:rPr>
           <w:rFonts w:ascii="Times New Roman" w:eastAsia="Times New Roman" w:hAnsi="Times New Roman" w:cs="Times New Roman"/>
@@ -15359,7 +15359,7 @@
         <w:pStyle w:val="1"/>
         <w:pageBreakBefore/>
       </w:pPr>
-      <w:bookmarkStart w:id="6" w:name="_Toc241668346"/>
+      <w:bookmarkStart w:id="6" w:name="_Toc241668470"/>
       <w:r>
         <w:rPr>
           <w:rFonts w:ascii="Times New Roman" w:eastAsia="Times New Roman" w:hAnsi="Times New Roman" w:cs="Times New Roman"/>
@@ -15763,31 +15763,31 @@
       </w:rPr>
     </w:lvl>
   </w:abstractNum>
-  <w:num w:numId="1" w16cid:durableId="1874075215">
+  <w:num w:numId="1" w16cid:durableId="1398437779">
     <w:abstractNumId w:val="8"/>
   </w:num>
-  <w:num w:numId="2" w16cid:durableId="82263154">
+  <w:num w:numId="2" w16cid:durableId="1610888824">
     <w:abstractNumId w:val="6"/>
   </w:num>
-  <w:num w:numId="3" w16cid:durableId="1861622842">
+  <w:num w:numId="3" w16cid:durableId="2032223090">
     <w:abstractNumId w:val="5"/>
   </w:num>
-  <w:num w:numId="4" w16cid:durableId="1188444342">
+  <w:num w:numId="4" w16cid:durableId="1486119223">
     <w:abstractNumId w:val="4"/>
   </w:num>
-  <w:num w:numId="5" w16cid:durableId="521676361">
+  <w:num w:numId="5" w16cid:durableId="9062979">
     <w:abstractNumId w:val="7"/>
   </w:num>
-  <w:num w:numId="6" w16cid:durableId="279650550">
+  <w:num w:numId="6" w16cid:durableId="981077464">
     <w:abstractNumId w:val="3"/>
   </w:num>
-  <w:num w:numId="7" w16cid:durableId="364333800">
+  <w:num w:numId="7" w16cid:durableId="635450359">
     <w:abstractNumId w:val="2"/>
   </w:num>
-  <w:num w:numId="8" w16cid:durableId="1108157850">
+  <w:num w:numId="8" w16cid:durableId="1330253112">
     <w:abstractNumId w:val="1"/>
   </w:num>
-  <w:num w:numId="9" w16cid:durableId="1773357380">
+  <w:num w:numId="9" w16cid:durableId="1911882854">
     <w:abstractNumId w:val="0"/>
   </w:num>
 </w:numbering>
@@ -27225,7 +27225,7 @@
     <w:autoRedefine/>
     <w:uiPriority w:val="39"/>
     <w:unhideWhenUsed/>
-    <w:rsid w:val="000501F4"/>
+    <w:rsid w:val="001A7E84"/>
     <w:pPr>
       <w:spacing w:after="100"/>
     </w:pPr>
@@ -27237,7 +27237,7 @@
     <w:autoRedefine/>
     <w:uiPriority w:val="39"/>
     <w:unhideWhenUsed/>
-    <w:rsid w:val="000501F4"/>
+    <w:rsid w:val="001A7E84"/>
     <w:pPr>
       <w:spacing w:after="100"/>
       <w:ind w:left="280"/>
@@ -27248,7 +27248,7 @@
     <w:basedOn w:val="a2"/>
     <w:uiPriority w:val="99"/>
     <w:unhideWhenUsed/>
-    <w:rsid w:val="000501F4"/>
+    <w:rsid w:val="001A7E84"/>
     <w:rPr>
       <w:color w:val="0000FF" w:themeColor="hyperlink"/>
       <w:u w:val="single"/>

</xml_diff>

<commit_message>
feat(lab_2): fix top-2 ciphertext symbols in cryptanalysis hypotheses and test suite
</commit_message>
<xml_diff>
--- a/lab_2/report.docx
+++ b/lab_2/report.docx
@@ -335,7 +335,7 @@
       <w:r>
         <w:fldChar w:fldCharType="separate"/>
       </w:r>
-      <w:hyperlink w:anchor="_Toc241668680" w:history="1">
+      <w:hyperlink w:anchor="_Toc241671326" w:history="1">
         <w:r>
           <w:rPr>
             <w:rStyle w:val="aff8"/>
@@ -362,7 +362,7 @@
             <w:noProof/>
             <w:webHidden/>
           </w:rPr>
-          <w:instrText xml:space="preserve"> PAGEREF _Toc241668680 \h </w:instrText>
+          <w:instrText xml:space="preserve"> PAGEREF _Toc241671326 \h </w:instrText>
         </w:r>
         <w:r>
           <w:rPr>
@@ -409,7 +409,7 @@
           <w14:ligatures w14:val="standardContextual"/>
         </w:rPr>
       </w:pPr>
-      <w:hyperlink w:anchor="_Toc241668681" w:history="1">
+      <w:hyperlink w:anchor="_Toc241671327" w:history="1">
         <w:r>
           <w:rPr>
             <w:rStyle w:val="aff8"/>
@@ -436,7 +436,7 @@
             <w:noProof/>
             <w:webHidden/>
           </w:rPr>
-          <w:instrText xml:space="preserve"> PAGEREF _Toc241668681 \h </w:instrText>
+          <w:instrText xml:space="preserve"> PAGEREF _Toc241671327 \h </w:instrText>
         </w:r>
         <w:r>
           <w:rPr>
@@ -483,7 +483,7 @@
           <w14:ligatures w14:val="standardContextual"/>
         </w:rPr>
       </w:pPr>
-      <w:hyperlink w:anchor="_Toc241668682" w:history="1">
+      <w:hyperlink w:anchor="_Toc241671328" w:history="1">
         <w:r>
           <w:rPr>
             <w:rStyle w:val="aff8"/>
@@ -510,7 +510,7 @@
             <w:noProof/>
             <w:webHidden/>
           </w:rPr>
-          <w:instrText xml:space="preserve"> PAGEREF _Toc241668682 \h </w:instrText>
+          <w:instrText xml:space="preserve"> PAGEREF _Toc241671328 \h </w:instrText>
         </w:r>
         <w:r>
           <w:rPr>
@@ -557,7 +557,7 @@
           <w14:ligatures w14:val="standardContextual"/>
         </w:rPr>
       </w:pPr>
-      <w:hyperlink w:anchor="_Toc241668683" w:history="1">
+      <w:hyperlink w:anchor="_Toc241671329" w:history="1">
         <w:r>
           <w:rPr>
             <w:rStyle w:val="aff8"/>
@@ -584,7 +584,7 @@
             <w:noProof/>
             <w:webHidden/>
           </w:rPr>
-          <w:instrText xml:space="preserve"> PAGEREF _Toc241668683 \h </w:instrText>
+          <w:instrText xml:space="preserve"> PAGEREF _Toc241671329 \h </w:instrText>
         </w:r>
         <w:r>
           <w:rPr>
@@ -631,7 +631,7 @@
           <w14:ligatures w14:val="standardContextual"/>
         </w:rPr>
       </w:pPr>
-      <w:hyperlink w:anchor="_Toc241668684" w:history="1">
+      <w:hyperlink w:anchor="_Toc241671330" w:history="1">
         <w:r>
           <w:rPr>
             <w:rStyle w:val="aff8"/>
@@ -658,7 +658,7 @@
             <w:noProof/>
             <w:webHidden/>
           </w:rPr>
-          <w:instrText xml:space="preserve"> PAGEREF _Toc241668684 \h </w:instrText>
+          <w:instrText xml:space="preserve"> PAGEREF _Toc241671330 \h </w:instrText>
         </w:r>
         <w:r>
           <w:rPr>
@@ -705,7 +705,7 @@
           <w14:ligatures w14:val="standardContextual"/>
         </w:rPr>
       </w:pPr>
-      <w:hyperlink w:anchor="_Toc241668685" w:history="1">
+      <w:hyperlink w:anchor="_Toc241671331" w:history="1">
         <w:r>
           <w:rPr>
             <w:rStyle w:val="aff8"/>
@@ -732,7 +732,7 @@
             <w:noProof/>
             <w:webHidden/>
           </w:rPr>
-          <w:instrText xml:space="preserve"> PAGEREF _Toc241668685 \h </w:instrText>
+          <w:instrText xml:space="preserve"> PAGEREF _Toc241671331 \h </w:instrText>
         </w:r>
         <w:r>
           <w:rPr>
@@ -779,7 +779,7 @@
           <w14:ligatures w14:val="standardContextual"/>
         </w:rPr>
       </w:pPr>
-      <w:hyperlink w:anchor="_Toc241668686" w:history="1">
+      <w:hyperlink w:anchor="_Toc241671332" w:history="1">
         <w:r>
           <w:rPr>
             <w:rStyle w:val="aff8"/>
@@ -806,7 +806,7 @@
             <w:noProof/>
             <w:webHidden/>
           </w:rPr>
-          <w:instrText xml:space="preserve"> PAGEREF _Toc241668686 \h </w:instrText>
+          <w:instrText xml:space="preserve"> PAGEREF _Toc241671332 \h </w:instrText>
         </w:r>
         <w:r>
           <w:rPr>
@@ -851,7 +851,7 @@
         <w:pStyle w:val="1"/>
         <w:pageBreakBefore/>
       </w:pPr>
-      <w:bookmarkStart w:id="0" w:name="_Toc241668680"/>
+      <w:bookmarkStart w:id="0" w:name="_Toc241671326"/>
       <w:r>
         <w:rPr>
           <w:rFonts w:ascii="Times New Roman" w:eastAsia="Times New Roman" w:hAnsi="Times New Roman" w:cs="Times New Roman"/>
@@ -1060,7 +1060,7 @@
         <w:pStyle w:val="1"/>
         <w:pageBreakBefore/>
       </w:pPr>
-      <w:bookmarkStart w:id="1" w:name="_Toc241668681"/>
+      <w:bookmarkStart w:id="1" w:name="_Toc241671327"/>
       <w:r>
         <w:rPr>
           <w:rFonts w:ascii="Times New Roman" w:eastAsia="Times New Roman" w:hAnsi="Times New Roman" w:cs="Times New Roman"/>
@@ -1075,7 +1075,7 @@
       <w:pPr>
         <w:pStyle w:val="21"/>
       </w:pPr>
-      <w:bookmarkStart w:id="2" w:name="_Toc241668682"/>
+      <w:bookmarkStart w:id="2" w:name="_Toc241671328"/>
       <w:r>
         <w:rPr>
           <w:rFonts w:ascii="Times New Roman" w:eastAsia="Times New Roman" w:hAnsi="Times New Roman" w:cs="Times New Roman"/>
@@ -5455,7 +5455,7 @@
       <w:pPr>
         <w:pStyle w:val="21"/>
       </w:pPr>
-      <w:bookmarkStart w:id="3" w:name="_Toc241668683"/>
+      <w:bookmarkStart w:id="3" w:name="_Toc241671329"/>
       <w:r>
         <w:rPr>
           <w:rFonts w:ascii="Times New Roman" w:eastAsia="Times New Roman" w:hAnsi="Times New Roman" w:cs="Times New Roman"/>
@@ -7673,164 +7673,240 @@
         <w:jc w:val="both"/>
       </w:pPr>
       <w:r>
-        <w:t xml:space="preserve">Рассмотрим основную рабочую гипотезу, согласно которой наиболее частая буква русского языка </w:t>
+        <w:t xml:space="preserve">Рассмотрим последовательное выдвижение гипотез в соответствии с методическими указаниями: в шифр-тексте фиксируются два наиболее частых символа </w:t>
+      </w:r>
+      <m:oMath>
+        <m:box>
+          <m:boxPr>
+            <m:ctrlPr>
+              <w:rPr>
+                <w:rFonts w:ascii="Cambria Math" w:hAnsi="Cambria Math"/>
+              </w:rPr>
+            </m:ctrlPr>
+          </m:boxPr>
+          <m:e>
+            <m:sSub>
+              <m:sSubPr>
+                <m:ctrlPr>
+                  <w:rPr>
+                    <w:rFonts w:ascii="Cambria Math" w:hAnsi="Cambria Math"/>
+                  </w:rPr>
+                </m:ctrlPr>
+              </m:sSubPr>
+              <m:e>
+                <m:r>
+                  <w:rPr>
+                    <w:rFonts w:ascii="Cambria Math" w:hAnsi="Cambria Math"/>
+                  </w:rPr>
+                  <m:t>y</m:t>
+                </m:r>
+              </m:e>
+              <m:sub>
+                <m:r>
+                  <m:rPr>
+                    <m:sty m:val="p"/>
+                  </m:rPr>
+                  <w:rPr>
+                    <w:rFonts w:ascii="Cambria Math" w:hAnsi="Cambria Math"/>
+                  </w:rPr>
+                  <m:t>1</m:t>
+                </m:r>
+              </m:sub>
+            </m:sSub>
+            <m:r>
+              <m:rPr>
+                <m:sty m:val="p"/>
+              </m:rPr>
+              <w:rPr>
+                <w:rFonts w:ascii="Cambria Math" w:hAnsi="Cambria Math"/>
+              </w:rPr>
+              <m:t>=</m:t>
+            </m:r>
+            <m:r>
+              <m:rPr>
+                <m:nor/>
+              </m:rPr>
+              <m:t>'з'</m:t>
+            </m:r>
+          </m:e>
+        </m:box>
+      </m:oMath>
+      <w:r>
+        <w:t xml:space="preserve"> (код 7) и </w:t>
+      </w:r>
+      <m:oMath>
+        <m:box>
+          <m:boxPr>
+            <m:ctrlPr>
+              <w:rPr>
+                <w:rFonts w:ascii="Cambria Math" w:hAnsi="Cambria Math"/>
+              </w:rPr>
+            </m:ctrlPr>
+          </m:boxPr>
+          <m:e>
+            <m:sSub>
+              <m:sSubPr>
+                <m:ctrlPr>
+                  <w:rPr>
+                    <w:rFonts w:ascii="Cambria Math" w:hAnsi="Cambria Math"/>
+                  </w:rPr>
+                </m:ctrlPr>
+              </m:sSubPr>
+              <m:e>
+                <m:r>
+                  <w:rPr>
+                    <w:rFonts w:ascii="Cambria Math" w:hAnsi="Cambria Math"/>
+                  </w:rPr>
+                  <m:t>y</m:t>
+                </m:r>
+              </m:e>
+              <m:sub>
+                <m:r>
+                  <m:rPr>
+                    <m:sty m:val="p"/>
+                  </m:rPr>
+                  <w:rPr>
+                    <w:rFonts w:ascii="Cambria Math" w:hAnsi="Cambria Math"/>
+                  </w:rPr>
+                  <m:t>2</m:t>
+                </m:r>
+              </m:sub>
+            </m:sSub>
+            <m:r>
+              <m:rPr>
+                <m:sty m:val="p"/>
+              </m:rPr>
+              <w:rPr>
+                <w:rFonts w:ascii="Cambria Math" w:hAnsi="Cambria Math"/>
+              </w:rPr>
+              <m:t>=</m:t>
+            </m:r>
+            <m:r>
+              <m:rPr>
+                <m:nor/>
+              </m:rPr>
+              <m:t>'м'</m:t>
+            </m:r>
+          </m:e>
+        </m:box>
+      </m:oMath>
+      <w:r>
+        <w:t xml:space="preserve"> (код 12), а в качестве открытых символов перебираются пары букв русского языка в порядке убывания эталонных частот:</w:t>
+      </w:r>
+    </w:p>
+    <w:p>
+      <w:pPr>
+        <w:ind w:left="425" w:firstLine="0"/>
+        <w:jc w:val="both"/>
+      </w:pPr>
+      <w:r>
+        <w:t xml:space="preserve">1. </w:t>
       </w:r>
       <w:r>
         <w:rPr>
-          <w:rFonts w:ascii="DejaVu Sans" w:eastAsia="DejaVu Sans" w:hAnsi="DejaVu Sans" w:cs="DejaVu Sans"/>
-          <w:sz w:val="22"/>
+          <w:b/>
         </w:rPr>
-        <w:t>'о'</w:t>
-      </w:r>
-      <w:r>
-        <w:t xml:space="preserve"> перешла в наиболее частую букву шифр-текста </w:t>
-      </w:r>
-      <w:r>
-        <w:rPr>
-          <w:rFonts w:ascii="DejaVu Sans" w:eastAsia="DejaVu Sans" w:hAnsi="DejaVu Sans" w:cs="DejaVu Sans"/>
-          <w:sz w:val="22"/>
-        </w:rPr>
-        <w:t>'з'</w:t>
-      </w:r>
-      <w:r>
-        <w:t xml:space="preserve">, а вторая по частоте буква </w:t>
-      </w:r>
-      <w:r>
-        <w:rPr>
-          <w:rFonts w:ascii="DejaVu Sans" w:eastAsia="DejaVu Sans" w:hAnsi="DejaVu Sans" w:cs="DejaVu Sans"/>
-          <w:sz w:val="22"/>
-        </w:rPr>
-        <w:t>'е'</w:t>
-      </w:r>
-      <w:r>
-        <w:t xml:space="preserve"> – в букву </w:t>
-      </w:r>
-      <w:r>
-        <w:rPr>
-          <w:rFonts w:ascii="DejaVu Sans" w:eastAsia="DejaVu Sans" w:hAnsi="DejaVu Sans" w:cs="DejaVu Sans"/>
-          <w:sz w:val="22"/>
-        </w:rPr>
-        <w:t>'м'</w:t>
-      </w:r>
-      <w:r>
-        <w:t>:</w:t>
-      </w:r>
-    </w:p>
-    <w:p>
-      <w:pPr>
-        <w:spacing w:before="120" w:after="120"/>
-        <w:ind w:firstLine="0"/>
-        <w:jc w:val="center"/>
-      </w:pPr>
-      <m:oMathPara>
-        <m:oMath>
-          <m:box>
-            <m:boxPr>
-              <m:ctrlPr>
-                <w:rPr>
-                  <w:rFonts w:ascii="Cambria Math" w:hAnsi="Cambria Math"/>
-                </w:rPr>
-              </m:ctrlPr>
-            </m:boxPr>
-            <m:e>
-              <m:r>
-                <w:rPr>
-                  <w:rFonts w:ascii="Cambria Math" w:hAnsi="Cambria Math"/>
-                </w:rPr>
-                <m:t>E</m:t>
-              </m:r>
-              <m:r>
-                <m:rPr>
-                  <m:sty m:val="p"/>
-                </m:rPr>
-                <w:rPr>
-                  <w:rFonts w:ascii="Cambria Math" w:hAnsi="Cambria Math"/>
-                </w:rPr>
-                <m:t>(</m:t>
-              </m:r>
-              <m:r>
-                <m:rPr>
-                  <m:nor/>
-                </m:rPr>
-                <m:t>'о'</m:t>
-              </m:r>
-              <m:r>
-                <m:rPr>
-                  <m:sty m:val="p"/>
-                </m:rPr>
-                <w:rPr>
-                  <w:rFonts w:ascii="Cambria Math" w:hAnsi="Cambria Math"/>
-                </w:rPr>
-                <m:t>)=</m:t>
-              </m:r>
-              <m:r>
-                <m:rPr>
-                  <m:nor/>
-                </m:rPr>
-                <m:t>'з'</m:t>
-              </m:r>
-              <m:r>
-                <m:rPr>
-                  <m:sty m:val="p"/>
-                </m:rPr>
-                <w:rPr>
-                  <w:rFonts w:ascii="Cambria Math" w:hAnsi="Cambria Math"/>
-                </w:rPr>
-                <m:t>,</m:t>
-              </m:r>
-              <m:r>
-                <m:rPr>
-                  <m:nor/>
-                </m:rPr>
-                <m:t>   </m:t>
-              </m:r>
-              <m:r>
-                <w:rPr>
-                  <w:rFonts w:ascii="Cambria Math" w:hAnsi="Cambria Math"/>
-                </w:rPr>
-                <m:t>E</m:t>
-              </m:r>
-              <m:r>
-                <m:rPr>
-                  <m:sty m:val="p"/>
-                </m:rPr>
-                <w:rPr>
-                  <w:rFonts w:ascii="Cambria Math" w:hAnsi="Cambria Math"/>
-                </w:rPr>
-                <m:t>(</m:t>
-              </m:r>
-              <m:r>
-                <m:rPr>
-                  <m:nor/>
-                </m:rPr>
-                <m:t>'е'</m:t>
-              </m:r>
-              <m:r>
-                <m:rPr>
-                  <m:sty m:val="p"/>
-                </m:rPr>
-                <w:rPr>
-                  <w:rFonts w:ascii="Cambria Math" w:hAnsi="Cambria Math"/>
-                </w:rPr>
-                <m:t>)=</m:t>
-              </m:r>
-              <m:r>
-                <m:rPr>
-                  <m:nor/>
-                </m:rPr>
-                <m:t>'м'</m:t>
-              </m:r>
-            </m:e>
-          </m:box>
-        </m:oMath>
-      </m:oMathPara>
-    </w:p>
-    <w:p>
-      <w:pPr>
-        <w:jc w:val="both"/>
-      </w:pPr>
-      <w:r>
-        <w:t xml:space="preserve">По таблице кодировки символов находим числовые индексы: </w:t>
+        <w:t>Первая гипотеза:</w:t>
+      </w:r>
+      <w:r>
+        <w:t xml:space="preserve"> сопоставление с двумя первыми по частоте буквами русского языка </w:t>
+      </w:r>
+      <m:oMath>
+        <m:box>
+          <m:boxPr>
+            <m:ctrlPr>
+              <w:rPr>
+                <w:rFonts w:ascii="Cambria Math" w:hAnsi="Cambria Math"/>
+              </w:rPr>
+            </m:ctrlPr>
+          </m:boxPr>
+          <m:e>
+            <m:r>
+              <w:rPr>
+                <w:rFonts w:ascii="Cambria Math" w:hAnsi="Cambria Math"/>
+              </w:rPr>
+              <m:t>E</m:t>
+            </m:r>
+            <m:r>
+              <m:rPr>
+                <m:sty m:val="p"/>
+              </m:rPr>
+              <w:rPr>
+                <w:rFonts w:ascii="Cambria Math" w:hAnsi="Cambria Math"/>
+              </w:rPr>
+              <m:t>(</m:t>
+            </m:r>
+            <m:r>
+              <m:rPr>
+                <m:nor/>
+              </m:rPr>
+              <m:t>'о'</m:t>
+            </m:r>
+            <m:r>
+              <m:rPr>
+                <m:sty m:val="p"/>
+              </m:rPr>
+              <w:rPr>
+                <w:rFonts w:ascii="Cambria Math" w:hAnsi="Cambria Math"/>
+              </w:rPr>
+              <m:t>)=</m:t>
+            </m:r>
+            <m:r>
+              <m:rPr>
+                <m:nor/>
+              </m:rPr>
+              <m:t>'з'</m:t>
+            </m:r>
+            <m:r>
+              <m:rPr>
+                <m:sty m:val="p"/>
+              </m:rPr>
+              <w:rPr>
+                <w:rFonts w:ascii="Cambria Math" w:hAnsi="Cambria Math"/>
+              </w:rPr>
+              <m:t>,</m:t>
+            </m:r>
+            <m:r>
+              <w:rPr>
+                <w:rFonts w:ascii="Cambria Math" w:hAnsi="Cambria Math"/>
+              </w:rPr>
+              <m:t>E</m:t>
+            </m:r>
+            <m:r>
+              <m:rPr>
+                <m:sty m:val="p"/>
+              </m:rPr>
+              <w:rPr>
+                <w:rFonts w:ascii="Cambria Math" w:hAnsi="Cambria Math"/>
+              </w:rPr>
+              <m:t>(</m:t>
+            </m:r>
+            <m:r>
+              <m:rPr>
+                <m:nor/>
+              </m:rPr>
+              <m:t>'е'</m:t>
+            </m:r>
+            <m:r>
+              <m:rPr>
+                <m:sty m:val="p"/>
+              </m:rPr>
+              <w:rPr>
+                <w:rFonts w:ascii="Cambria Math" w:hAnsi="Cambria Math"/>
+              </w:rPr>
+              <m:t>)=</m:t>
+            </m:r>
+            <m:r>
+              <m:rPr>
+                <m:nor/>
+              </m:rPr>
+              <m:t>'м'</m:t>
+            </m:r>
+          </m:e>
+        </m:box>
+      </m:oMath>
+      <w:r>
+        <w:t xml:space="preserve"> (</w:t>
       </w:r>
       <m:oMath>
         <m:box>
@@ -7877,137 +7953,8 @@
               <w:rPr>
                 <w:rFonts w:ascii="Cambria Math" w:hAnsi="Cambria Math"/>
               </w:rPr>
-              <m:t>=</m:t>
-            </m:r>
-            <m:r>
-              <w:rPr>
-                <w:rFonts w:ascii="Cambria Math" w:hAnsi="Cambria Math"/>
-              </w:rPr>
-              <m:t>A</m:t>
-            </m:r>
-            <m:r>
-              <m:rPr>
-                <m:sty m:val="p"/>
-              </m:rPr>
-              <w:rPr>
-                <w:rFonts w:ascii="Cambria Math" w:hAnsi="Cambria Math"/>
-              </w:rPr>
-              <m:t>(</m:t>
-            </m:r>
-            <m:r>
-              <m:rPr>
-                <m:nor/>
-              </m:rPr>
-              <m:t>'о'</m:t>
-            </m:r>
-            <m:r>
-              <m:rPr>
-                <m:sty m:val="p"/>
-              </m:rPr>
-              <w:rPr>
-                <w:rFonts w:ascii="Cambria Math" w:hAnsi="Cambria Math"/>
-              </w:rPr>
-              <m:t>)=14</m:t>
-            </m:r>
-          </m:e>
-        </m:box>
-      </m:oMath>
-      <w:r>
-        <w:t xml:space="preserve">, </w:t>
-      </w:r>
-      <m:oMath>
-        <m:box>
-          <m:boxPr>
-            <m:ctrlPr>
-              <w:rPr>
-                <w:rFonts w:ascii="Cambria Math" w:hAnsi="Cambria Math"/>
-              </w:rPr>
-            </m:ctrlPr>
-          </m:boxPr>
-          <m:e>
-            <m:sSub>
-              <m:sSubPr>
-                <m:ctrlPr>
-                  <w:rPr>
-                    <w:rFonts w:ascii="Cambria Math" w:hAnsi="Cambria Math"/>
-                  </w:rPr>
-                </m:ctrlPr>
-              </m:sSubPr>
-              <m:e>
-                <m:r>
-                  <w:rPr>
-                    <w:rFonts w:ascii="Cambria Math" w:hAnsi="Cambria Math"/>
-                  </w:rPr>
-                  <m:t>y</m:t>
-                </m:r>
-              </m:e>
-              <m:sub>
-                <m:r>
-                  <m:rPr>
-                    <m:sty m:val="p"/>
-                  </m:rPr>
-                  <w:rPr>
-                    <w:rFonts w:ascii="Cambria Math" w:hAnsi="Cambria Math"/>
-                  </w:rPr>
-                  <m:t>1</m:t>
-                </m:r>
-              </m:sub>
-            </m:sSub>
-            <m:r>
-              <m:rPr>
-                <m:sty m:val="p"/>
-              </m:rPr>
-              <w:rPr>
-                <w:rFonts w:ascii="Cambria Math" w:hAnsi="Cambria Math"/>
-              </w:rPr>
-              <m:t>=</m:t>
-            </m:r>
-            <m:r>
-              <w:rPr>
-                <w:rFonts w:ascii="Cambria Math" w:hAnsi="Cambria Math"/>
-              </w:rPr>
-              <m:t>A</m:t>
-            </m:r>
-            <m:r>
-              <m:rPr>
-                <m:sty m:val="p"/>
-              </m:rPr>
-              <w:rPr>
-                <w:rFonts w:ascii="Cambria Math" w:hAnsi="Cambria Math"/>
-              </w:rPr>
-              <m:t>(</m:t>
-            </m:r>
-            <m:r>
-              <m:rPr>
-                <m:nor/>
-              </m:rPr>
-              <m:t>'з'</m:t>
-            </m:r>
-            <m:r>
-              <m:rPr>
-                <m:sty m:val="p"/>
-              </m:rPr>
-              <w:rPr>
-                <w:rFonts w:ascii="Cambria Math" w:hAnsi="Cambria Math"/>
-              </w:rPr>
-              <m:t>)=7</m:t>
-            </m:r>
-          </m:e>
-        </m:box>
-      </m:oMath>
-      <w:r>
-        <w:t xml:space="preserve">, </w:t>
-      </w:r>
-      <m:oMath>
-        <m:box>
-          <m:boxPr>
-            <m:ctrlPr>
-              <w:rPr>
-                <w:rFonts w:ascii="Cambria Math" w:hAnsi="Cambria Math"/>
-              </w:rPr>
-            </m:ctrlPr>
-          </m:boxPr>
-          <m:e>
+              <m:t>=14,</m:t>
+            </m:r>
             <m:sSub>
               <m:sSubPr>
                 <m:ctrlPr>
@@ -8043,126 +7990,13 @@
               <w:rPr>
                 <w:rFonts w:ascii="Cambria Math" w:hAnsi="Cambria Math"/>
               </w:rPr>
-              <m:t>=</m:t>
-            </m:r>
-            <m:r>
-              <w:rPr>
-                <w:rFonts w:ascii="Cambria Math" w:hAnsi="Cambria Math"/>
-              </w:rPr>
-              <m:t>A</m:t>
-            </m:r>
-            <m:r>
-              <m:rPr>
-                <m:sty m:val="p"/>
-              </m:rPr>
-              <w:rPr>
-                <w:rFonts w:ascii="Cambria Math" w:hAnsi="Cambria Math"/>
-              </w:rPr>
-              <m:t>(</m:t>
-            </m:r>
-            <m:r>
-              <m:rPr>
-                <m:nor/>
-              </m:rPr>
-              <m:t>'е'</m:t>
-            </m:r>
-            <m:r>
-              <m:rPr>
-                <m:sty m:val="p"/>
-              </m:rPr>
-              <w:rPr>
-                <w:rFonts w:ascii="Cambria Math" w:hAnsi="Cambria Math"/>
-              </w:rPr>
-              <m:t>)=5</m:t>
+              <m:t>=5</m:t>
             </m:r>
           </m:e>
         </m:box>
       </m:oMath>
       <w:r>
-        <w:t xml:space="preserve">, </w:t>
-      </w:r>
-      <m:oMath>
-        <m:box>
-          <m:boxPr>
-            <m:ctrlPr>
-              <w:rPr>
-                <w:rFonts w:ascii="Cambria Math" w:hAnsi="Cambria Math"/>
-              </w:rPr>
-            </m:ctrlPr>
-          </m:boxPr>
-          <m:e>
-            <m:sSub>
-              <m:sSubPr>
-                <m:ctrlPr>
-                  <w:rPr>
-                    <w:rFonts w:ascii="Cambria Math" w:hAnsi="Cambria Math"/>
-                  </w:rPr>
-                </m:ctrlPr>
-              </m:sSubPr>
-              <m:e>
-                <m:r>
-                  <w:rPr>
-                    <w:rFonts w:ascii="Cambria Math" w:hAnsi="Cambria Math"/>
-                  </w:rPr>
-                  <m:t>y</m:t>
-                </m:r>
-              </m:e>
-              <m:sub>
-                <m:r>
-                  <m:rPr>
-                    <m:sty m:val="p"/>
-                  </m:rPr>
-                  <w:rPr>
-                    <w:rFonts w:ascii="Cambria Math" w:hAnsi="Cambria Math"/>
-                  </w:rPr>
-                  <m:t>2</m:t>
-                </m:r>
-              </m:sub>
-            </m:sSub>
-            <m:r>
-              <m:rPr>
-                <m:sty m:val="p"/>
-              </m:rPr>
-              <w:rPr>
-                <w:rFonts w:ascii="Cambria Math" w:hAnsi="Cambria Math"/>
-              </w:rPr>
-              <m:t>=</m:t>
-            </m:r>
-            <m:r>
-              <w:rPr>
-                <w:rFonts w:ascii="Cambria Math" w:hAnsi="Cambria Math"/>
-              </w:rPr>
-              <m:t>A</m:t>
-            </m:r>
-            <m:r>
-              <m:rPr>
-                <m:sty m:val="p"/>
-              </m:rPr>
-              <w:rPr>
-                <w:rFonts w:ascii="Cambria Math" w:hAnsi="Cambria Math"/>
-              </w:rPr>
-              <m:t>(</m:t>
-            </m:r>
-            <m:r>
-              <m:rPr>
-                <m:nor/>
-              </m:rPr>
-              <m:t>'м'</m:t>
-            </m:r>
-            <m:r>
-              <m:rPr>
-                <m:sty m:val="p"/>
-              </m:rPr>
-              <w:rPr>
-                <w:rFonts w:ascii="Cambria Math" w:hAnsi="Cambria Math"/>
-              </w:rPr>
-              <m:t>)=12</m:t>
-            </m:r>
-          </m:e>
-        </m:box>
-      </m:oMath>
-      <w:r>
-        <w:t>. Получаем систему сравнений:</w:t>
+        <w:t>):</w:t>
       </w:r>
     </w:p>
     <w:p>
@@ -8478,753 +8312,7 @@
         <w:jc w:val="both"/>
       </w:pPr>
       <w:r>
-        <w:t xml:space="preserve">Для демонстрации несовместной системы рассмотрим альтернативную гипотезу </w:t>
-      </w:r>
-      <m:oMath>
-        <m:box>
-          <m:boxPr>
-            <m:ctrlPr>
-              <w:rPr>
-                <w:rFonts w:ascii="Cambria Math" w:hAnsi="Cambria Math"/>
-              </w:rPr>
-            </m:ctrlPr>
-          </m:boxPr>
-          <m:e>
-            <m:r>
-              <w:rPr>
-                <w:rFonts w:ascii="Cambria Math" w:hAnsi="Cambria Math"/>
-              </w:rPr>
-              <m:t>E</m:t>
-            </m:r>
-            <m:r>
-              <m:rPr>
-                <m:sty m:val="p"/>
-              </m:rPr>
-              <w:rPr>
-                <w:rFonts w:ascii="Cambria Math" w:hAnsi="Cambria Math"/>
-              </w:rPr>
-              <m:t>(</m:t>
-            </m:r>
-            <m:r>
-              <m:rPr>
-                <m:nor/>
-              </m:rPr>
-              <m:t>'д'</m:t>
-            </m:r>
-            <m:r>
-              <m:rPr>
-                <m:sty m:val="p"/>
-              </m:rPr>
-              <w:rPr>
-                <w:rFonts w:ascii="Cambria Math" w:hAnsi="Cambria Math"/>
-              </w:rPr>
-              <m:t>)=</m:t>
-            </m:r>
-            <m:r>
-              <m:rPr>
-                <m:nor/>
-              </m:rPr>
-              <m:t>'з'</m:t>
-            </m:r>
-          </m:e>
-        </m:box>
-      </m:oMath>
-      <w:r>
-        <w:t xml:space="preserve"> (</w:t>
-      </w:r>
-      <m:oMath>
-        <m:box>
-          <m:boxPr>
-            <m:ctrlPr>
-              <w:rPr>
-                <w:rFonts w:ascii="Cambria Math" w:hAnsi="Cambria Math"/>
-              </w:rPr>
-            </m:ctrlPr>
-          </m:boxPr>
-          <m:e>
-            <m:sSub>
-              <m:sSubPr>
-                <m:ctrlPr>
-                  <w:rPr>
-                    <w:rFonts w:ascii="Cambria Math" w:hAnsi="Cambria Math"/>
-                  </w:rPr>
-                </m:ctrlPr>
-              </m:sSubPr>
-              <m:e>
-                <m:r>
-                  <w:rPr>
-                    <w:rFonts w:ascii="Cambria Math" w:hAnsi="Cambria Math"/>
-                  </w:rPr>
-                  <m:t>x</m:t>
-                </m:r>
-              </m:e>
-              <m:sub>
-                <m:r>
-                  <m:rPr>
-                    <m:sty m:val="p"/>
-                  </m:rPr>
-                  <w:rPr>
-                    <w:rFonts w:ascii="Cambria Math" w:hAnsi="Cambria Math"/>
-                  </w:rPr>
-                  <m:t>1</m:t>
-                </m:r>
-              </m:sub>
-            </m:sSub>
-            <m:r>
-              <m:rPr>
-                <m:sty m:val="p"/>
-              </m:rPr>
-              <w:rPr>
-                <w:rFonts w:ascii="Cambria Math" w:hAnsi="Cambria Math"/>
-              </w:rPr>
-              <m:t>=4,</m:t>
-            </m:r>
-            <m:sSub>
-              <m:sSubPr>
-                <m:ctrlPr>
-                  <w:rPr>
-                    <w:rFonts w:ascii="Cambria Math" w:hAnsi="Cambria Math"/>
-                  </w:rPr>
-                </m:ctrlPr>
-              </m:sSubPr>
-              <m:e>
-                <m:r>
-                  <w:rPr>
-                    <w:rFonts w:ascii="Cambria Math" w:hAnsi="Cambria Math"/>
-                  </w:rPr>
-                  <m:t>y</m:t>
-                </m:r>
-              </m:e>
-              <m:sub>
-                <m:r>
-                  <m:rPr>
-                    <m:sty m:val="p"/>
-                  </m:rPr>
-                  <w:rPr>
-                    <w:rFonts w:ascii="Cambria Math" w:hAnsi="Cambria Math"/>
-                  </w:rPr>
-                  <m:t>1</m:t>
-                </m:r>
-              </m:sub>
-            </m:sSub>
-            <m:r>
-              <m:rPr>
-                <m:sty m:val="p"/>
-              </m:rPr>
-              <w:rPr>
-                <w:rFonts w:ascii="Cambria Math" w:hAnsi="Cambria Math"/>
-              </w:rPr>
-              <m:t>=7</m:t>
-            </m:r>
-          </m:e>
-        </m:box>
-      </m:oMath>
-      <w:r>
-        <w:t xml:space="preserve">) и </w:t>
-      </w:r>
-      <m:oMath>
-        <m:box>
-          <m:boxPr>
-            <m:ctrlPr>
-              <w:rPr>
-                <w:rFonts w:ascii="Cambria Math" w:hAnsi="Cambria Math"/>
-              </w:rPr>
-            </m:ctrlPr>
-          </m:boxPr>
-          <m:e>
-            <m:r>
-              <w:rPr>
-                <w:rFonts w:ascii="Cambria Math" w:hAnsi="Cambria Math"/>
-              </w:rPr>
-              <m:t>E</m:t>
-            </m:r>
-            <m:r>
-              <m:rPr>
-                <m:sty m:val="p"/>
-              </m:rPr>
-              <w:rPr>
-                <w:rFonts w:ascii="Cambria Math" w:hAnsi="Cambria Math"/>
-              </w:rPr>
-              <m:t>(</m:t>
-            </m:r>
-            <m:r>
-              <m:rPr>
-                <m:nor/>
-              </m:rPr>
-              <m:t>'а'</m:t>
-            </m:r>
-            <m:r>
-              <m:rPr>
-                <m:sty m:val="p"/>
-              </m:rPr>
-              <w:rPr>
-                <w:rFonts w:ascii="Cambria Math" w:hAnsi="Cambria Math"/>
-              </w:rPr>
-              <m:t>)=</m:t>
-            </m:r>
-            <m:r>
-              <m:rPr>
-                <m:nor/>
-              </m:rPr>
-              <m:t>'м'</m:t>
-            </m:r>
-          </m:e>
-        </m:box>
-      </m:oMath>
-      <w:r>
-        <w:t xml:space="preserve"> (</w:t>
-      </w:r>
-      <m:oMath>
-        <m:box>
-          <m:boxPr>
-            <m:ctrlPr>
-              <w:rPr>
-                <w:rFonts w:ascii="Cambria Math" w:hAnsi="Cambria Math"/>
-              </w:rPr>
-            </m:ctrlPr>
-          </m:boxPr>
-          <m:e>
-            <m:sSub>
-              <m:sSubPr>
-                <m:ctrlPr>
-                  <w:rPr>
-                    <w:rFonts w:ascii="Cambria Math" w:hAnsi="Cambria Math"/>
-                  </w:rPr>
-                </m:ctrlPr>
-              </m:sSubPr>
-              <m:e>
-                <m:r>
-                  <w:rPr>
-                    <w:rFonts w:ascii="Cambria Math" w:hAnsi="Cambria Math"/>
-                  </w:rPr>
-                  <m:t>x</m:t>
-                </m:r>
-              </m:e>
-              <m:sub>
-                <m:r>
-                  <m:rPr>
-                    <m:sty m:val="p"/>
-                  </m:rPr>
-                  <w:rPr>
-                    <w:rFonts w:ascii="Cambria Math" w:hAnsi="Cambria Math"/>
-                  </w:rPr>
-                  <m:t>2</m:t>
-                </m:r>
-              </m:sub>
-            </m:sSub>
-            <m:r>
-              <m:rPr>
-                <m:sty m:val="p"/>
-              </m:rPr>
-              <w:rPr>
-                <w:rFonts w:ascii="Cambria Math" w:hAnsi="Cambria Math"/>
-              </w:rPr>
-              <m:t>=0,</m:t>
-            </m:r>
-            <m:sSub>
-              <m:sSubPr>
-                <m:ctrlPr>
-                  <w:rPr>
-                    <w:rFonts w:ascii="Cambria Math" w:hAnsi="Cambria Math"/>
-                  </w:rPr>
-                </m:ctrlPr>
-              </m:sSubPr>
-              <m:e>
-                <m:r>
-                  <w:rPr>
-                    <w:rFonts w:ascii="Cambria Math" w:hAnsi="Cambria Math"/>
-                  </w:rPr>
-                  <m:t>y</m:t>
-                </m:r>
-              </m:e>
-              <m:sub>
-                <m:r>
-                  <m:rPr>
-                    <m:sty m:val="p"/>
-                  </m:rPr>
-                  <w:rPr>
-                    <w:rFonts w:ascii="Cambria Math" w:hAnsi="Cambria Math"/>
-                  </w:rPr>
-                  <m:t>2</m:t>
-                </m:r>
-              </m:sub>
-            </m:sSub>
-            <m:r>
-              <m:rPr>
-                <m:sty m:val="p"/>
-              </m:rPr>
-              <w:rPr>
-                <w:rFonts w:ascii="Cambria Math" w:hAnsi="Cambria Math"/>
-              </w:rPr>
-              <m:t>=12</m:t>
-            </m:r>
-          </m:e>
-        </m:box>
-      </m:oMath>
-      <w:r>
-        <w:t>):</w:t>
-      </w:r>
-    </w:p>
-    <w:p>
-      <w:pPr>
-        <w:spacing w:before="120" w:after="120"/>
-        <w:ind w:firstLine="0"/>
-        <w:jc w:val="center"/>
-      </w:pPr>
-      <m:oMathPara>
-        <m:oMath>
-          <m:box>
-            <m:boxPr>
-              <m:ctrlPr>
-                <w:rPr>
-                  <w:rFonts w:ascii="Cambria Math" w:hAnsi="Cambria Math"/>
-                </w:rPr>
-              </m:ctrlPr>
-            </m:boxPr>
-            <m:e>
-              <m:box>
-                <m:boxPr>
-                  <m:ctrlPr>
-                    <w:rPr>
-                      <w:rFonts w:ascii="Cambria Math" w:hAnsi="Cambria Math"/>
-                    </w:rPr>
-                  </m:ctrlPr>
-                </m:boxPr>
-                <m:e>
-                  <m:d>
-                    <m:dPr>
-                      <m:begChr m:val="{"/>
-                      <m:endChr m:val=""/>
-                      <m:ctrlPr>
-                        <w:rPr>
-                          <w:rFonts w:ascii="Cambria Math" w:hAnsi="Cambria Math"/>
-                        </w:rPr>
-                      </m:ctrlPr>
-                    </m:dPr>
-                    <m:e>
-                      <m:box>
-                        <m:boxPr>
-                          <m:ctrlPr>
-                            <w:rPr>
-                              <w:rFonts w:ascii="Cambria Math" w:hAnsi="Cambria Math"/>
-                            </w:rPr>
-                          </m:ctrlPr>
-                        </m:boxPr>
-                        <m:e>
-                          <m:m>
-                            <m:mPr>
-                              <m:mcs>
-                                <m:mc>
-                                  <m:mcPr>
-                                    <m:count m:val="1"/>
-                                    <m:mcJc m:val="center"/>
-                                  </m:mcPr>
-                                </m:mc>
-                              </m:mcs>
-                              <m:ctrlPr>
-                                <w:rPr>
-                                  <w:rFonts w:ascii="Cambria Math" w:hAnsi="Cambria Math"/>
-                                </w:rPr>
-                              </m:ctrlPr>
-                            </m:mPr>
-                            <m:mr>
-                              <m:e>
-                                <m:box>
-                                  <m:boxPr>
-                                    <m:ctrlPr>
-                                      <w:rPr>
-                                        <w:rFonts w:ascii="Cambria Math" w:hAnsi="Cambria Math"/>
-                                      </w:rPr>
-                                    </m:ctrlPr>
-                                  </m:boxPr>
-                                  <m:e>
-                                    <m:r>
-                                      <m:rPr>
-                                        <m:sty m:val="p"/>
-                                      </m:rPr>
-                                      <w:rPr>
-                                        <w:rFonts w:ascii="Cambria Math" w:hAnsi="Cambria Math"/>
-                                      </w:rPr>
-                                      <m:t>4</m:t>
-                                    </m:r>
-                                    <m:r>
-                                      <w:rPr>
-                                        <w:rFonts w:ascii="Cambria Math" w:hAnsi="Cambria Math"/>
-                                      </w:rPr>
-                                      <m:t>a</m:t>
-                                    </m:r>
-                                    <m:r>
-                                      <m:rPr>
-                                        <m:sty m:val="p"/>
-                                      </m:rPr>
-                                      <w:rPr>
-                                        <w:rFonts w:ascii="Cambria Math" w:hAnsi="Cambria Math"/>
-                                      </w:rPr>
-                                      <m:t>+</m:t>
-                                    </m:r>
-                                    <m:r>
-                                      <w:rPr>
-                                        <w:rFonts w:ascii="Cambria Math" w:hAnsi="Cambria Math"/>
-                                      </w:rPr>
-                                      <m:t>b</m:t>
-                                    </m:r>
-                                    <m:r>
-                                      <m:rPr>
-                                        <m:sty m:val="p"/>
-                                      </m:rPr>
-                                      <w:rPr>
-                                        <w:rFonts w:ascii="Cambria Math" w:hAnsi="Cambria Math"/>
-                                      </w:rPr>
-                                      <m:t>≡7</m:t>
-                                    </m:r>
-                                    <m:r>
-                                      <m:rPr>
-                                        <m:nor/>
-                                      </m:rPr>
-                                      <m:t>   </m:t>
-                                    </m:r>
-                                    <m:d>
-                                      <m:dPr>
-                                        <m:ctrlPr>
-                                          <w:rPr>
-                                            <w:rFonts w:ascii="Cambria Math" w:hAnsi="Cambria Math"/>
-                                          </w:rPr>
-                                        </m:ctrlPr>
-                                      </m:dPr>
-                                      <m:e>
-                                        <m:box>
-                                          <m:boxPr>
-                                            <m:ctrlPr>
-                                              <w:rPr>
-                                                <w:rFonts w:ascii="Cambria Math" w:hAnsi="Cambria Math"/>
-                                              </w:rPr>
-                                            </m:ctrlPr>
-                                          </m:boxPr>
-                                          <m:e>
-                                            <m:r>
-                                              <m:rPr>
-                                                <m:sty m:val="p"/>
-                                              </m:rPr>
-                                              <w:rPr>
-                                                <w:rFonts w:ascii="Cambria Math" w:hAnsi="Cambria Math"/>
-                                              </w:rPr>
-                                              <m:t>mod</m:t>
-                                            </m:r>
-                                            <m:r>
-                                              <m:rPr>
-                                                <m:nor/>
-                                              </m:rPr>
-                                              <m:t> </m:t>
-                                            </m:r>
-                                            <m:box>
-                                              <m:boxPr>
-                                                <m:ctrlPr>
-                                                  <w:rPr>
-                                                    <w:rFonts w:ascii="Cambria Math" w:hAnsi="Cambria Math"/>
-                                                  </w:rPr>
-                                                </m:ctrlPr>
-                                              </m:boxPr>
-                                              <m:e>
-                                                <m:r>
-                                                  <m:rPr>
-                                                    <m:sty m:val="p"/>
-                                                  </m:rPr>
-                                                  <w:rPr>
-                                                    <w:rFonts w:ascii="Cambria Math" w:hAnsi="Cambria Math"/>
-                                                  </w:rPr>
-                                                  <m:t>32</m:t>
-                                                </m:r>
-                                              </m:e>
-                                            </m:box>
-                                          </m:e>
-                                        </m:box>
-                                      </m:e>
-                                    </m:d>
-                                  </m:e>
-                                </m:box>
-                              </m:e>
-                            </m:mr>
-                            <m:mr>
-                              <m:e>
-                                <m:box>
-                                  <m:boxPr>
-                                    <m:ctrlPr>
-                                      <w:rPr>
-                                        <w:rFonts w:ascii="Cambria Math" w:hAnsi="Cambria Math"/>
-                                      </w:rPr>
-                                    </m:ctrlPr>
-                                  </m:boxPr>
-                                  <m:e>
-                                    <m:r>
-                                      <m:rPr>
-                                        <m:sty m:val="p"/>
-                                      </m:rPr>
-                                      <w:rPr>
-                                        <w:rFonts w:ascii="Cambria Math" w:hAnsi="Cambria Math"/>
-                                      </w:rPr>
-                                      <m:t>0</m:t>
-                                    </m:r>
-                                    <m:r>
-                                      <w:rPr>
-                                        <w:rFonts w:ascii="Cambria Math" w:hAnsi="Cambria Math"/>
-                                      </w:rPr>
-                                      <m:t>a</m:t>
-                                    </m:r>
-                                    <m:r>
-                                      <m:rPr>
-                                        <m:sty m:val="p"/>
-                                      </m:rPr>
-                                      <w:rPr>
-                                        <w:rFonts w:ascii="Cambria Math" w:hAnsi="Cambria Math"/>
-                                      </w:rPr>
-                                      <m:t>+</m:t>
-                                    </m:r>
-                                    <m:r>
-                                      <w:rPr>
-                                        <w:rFonts w:ascii="Cambria Math" w:hAnsi="Cambria Math"/>
-                                      </w:rPr>
-                                      <m:t>b</m:t>
-                                    </m:r>
-                                    <m:r>
-                                      <m:rPr>
-                                        <m:sty m:val="p"/>
-                                      </m:rPr>
-                                      <w:rPr>
-                                        <w:rFonts w:ascii="Cambria Math" w:hAnsi="Cambria Math"/>
-                                      </w:rPr>
-                                      <m:t>≡12</m:t>
-                                    </m:r>
-                                    <m:r>
-                                      <m:rPr>
-                                        <m:nor/>
-                                      </m:rPr>
-                                      <m:t>   </m:t>
-                                    </m:r>
-                                    <m:d>
-                                      <m:dPr>
-                                        <m:ctrlPr>
-                                          <w:rPr>
-                                            <w:rFonts w:ascii="Cambria Math" w:hAnsi="Cambria Math"/>
-                                          </w:rPr>
-                                        </m:ctrlPr>
-                                      </m:dPr>
-                                      <m:e>
-                                        <m:box>
-                                          <m:boxPr>
-                                            <m:ctrlPr>
-                                              <w:rPr>
-                                                <w:rFonts w:ascii="Cambria Math" w:hAnsi="Cambria Math"/>
-                                              </w:rPr>
-                                            </m:ctrlPr>
-                                          </m:boxPr>
-                                          <m:e>
-                                            <m:r>
-                                              <m:rPr>
-                                                <m:sty m:val="p"/>
-                                              </m:rPr>
-                                              <w:rPr>
-                                                <w:rFonts w:ascii="Cambria Math" w:hAnsi="Cambria Math"/>
-                                              </w:rPr>
-                                              <m:t>mod</m:t>
-                                            </m:r>
-                                            <m:r>
-                                              <m:rPr>
-                                                <m:nor/>
-                                              </m:rPr>
-                                              <m:t> </m:t>
-                                            </m:r>
-                                            <m:box>
-                                              <m:boxPr>
-                                                <m:ctrlPr>
-                                                  <w:rPr>
-                                                    <w:rFonts w:ascii="Cambria Math" w:hAnsi="Cambria Math"/>
-                                                  </w:rPr>
-                                                </m:ctrlPr>
-                                              </m:boxPr>
-                                              <m:e>
-                                                <m:r>
-                                                  <m:rPr>
-                                                    <m:sty m:val="p"/>
-                                                  </m:rPr>
-                                                  <w:rPr>
-                                                    <w:rFonts w:ascii="Cambria Math" w:hAnsi="Cambria Math"/>
-                                                  </w:rPr>
-                                                  <m:t>32</m:t>
-                                                </m:r>
-                                              </m:e>
-                                            </m:box>
-                                          </m:e>
-                                        </m:box>
-                                      </m:e>
-                                    </m:d>
-                                  </m:e>
-                                </m:box>
-                              </m:e>
-                            </m:mr>
-                          </m:m>
-                        </m:e>
-                      </m:box>
-                    </m:e>
-                  </m:d>
-                </m:e>
-              </m:box>
-            </m:e>
-          </m:box>
-        </m:oMath>
-      </m:oMathPara>
-    </w:p>
-    <w:p>
-      <w:pPr>
-        <w:jc w:val="both"/>
-      </w:pPr>
-      <w:r>
-        <w:rPr>
-          <w:b/>
-        </w:rPr>
-        <w:t>Решения систем уравнений:</w:t>
-      </w:r>
-    </w:p>
-    <w:p>
-      <w:pPr>
-        <w:ind w:left="425" w:firstLine="0"/>
-        <w:jc w:val="both"/>
-      </w:pPr>
-      <w:r>
-        <w:t xml:space="preserve">1. Решение системы для истинной гипотезы </w:t>
-      </w:r>
-      <m:oMath>
-        <m:box>
-          <m:boxPr>
-            <m:ctrlPr>
-              <w:rPr>
-                <w:rFonts w:ascii="Cambria Math" w:hAnsi="Cambria Math"/>
-              </w:rPr>
-            </m:ctrlPr>
-          </m:boxPr>
-          <m:e>
-            <m:r>
-              <w:rPr>
-                <w:rFonts w:ascii="Cambria Math" w:hAnsi="Cambria Math"/>
-              </w:rPr>
-              <m:t>E</m:t>
-            </m:r>
-            <m:r>
-              <m:rPr>
-                <m:sty m:val="p"/>
-              </m:rPr>
-              <w:rPr>
-                <w:rFonts w:ascii="Cambria Math" w:hAnsi="Cambria Math"/>
-              </w:rPr>
-              <m:t>(</m:t>
-            </m:r>
-            <m:r>
-              <m:rPr>
-                <m:nor/>
-              </m:rPr>
-              <m:t>'о'</m:t>
-            </m:r>
-            <m:r>
-              <m:rPr>
-                <m:sty m:val="p"/>
-              </m:rPr>
-              <w:rPr>
-                <w:rFonts w:ascii="Cambria Math" w:hAnsi="Cambria Math"/>
-              </w:rPr>
-              <m:t>)=</m:t>
-            </m:r>
-            <m:r>
-              <m:rPr>
-                <m:nor/>
-              </m:rPr>
-              <m:t>'з'</m:t>
-            </m:r>
-          </m:e>
-        </m:box>
-      </m:oMath>
-      <w:r>
-        <w:t xml:space="preserve">, </w:t>
-      </w:r>
-      <m:oMath>
-        <m:box>
-          <m:boxPr>
-            <m:ctrlPr>
-              <w:rPr>
-                <w:rFonts w:ascii="Cambria Math" w:hAnsi="Cambria Math"/>
-              </w:rPr>
-            </m:ctrlPr>
-          </m:boxPr>
-          <m:e>
-            <m:r>
-              <w:rPr>
-                <w:rFonts w:ascii="Cambria Math" w:hAnsi="Cambria Math"/>
-              </w:rPr>
-              <m:t>E</m:t>
-            </m:r>
-            <m:r>
-              <m:rPr>
-                <m:sty m:val="p"/>
-              </m:rPr>
-              <w:rPr>
-                <w:rFonts w:ascii="Cambria Math" w:hAnsi="Cambria Math"/>
-              </w:rPr>
-              <m:t>(</m:t>
-            </m:r>
-            <m:r>
-              <m:rPr>
-                <m:nor/>
-              </m:rPr>
-              <m:t>'е'</m:t>
-            </m:r>
-            <m:r>
-              <m:rPr>
-                <m:sty m:val="p"/>
-              </m:rPr>
-              <w:rPr>
-                <w:rFonts w:ascii="Cambria Math" w:hAnsi="Cambria Math"/>
-              </w:rPr>
-              <m:t>)=</m:t>
-            </m:r>
-            <m:r>
-              <m:rPr>
-                <m:nor/>
-              </m:rPr>
-              <m:t>'м'</m:t>
-            </m:r>
-          </m:e>
-        </m:box>
-      </m:oMath>
-      <w:r>
-        <w:t>:</w:t>
-      </w:r>
-    </w:p>
-    <w:p>
-      <w:pPr>
-        <w:jc w:val="both"/>
-      </w:pPr>
-      <w:r>
-        <w:t xml:space="preserve">Вычитаем второе сравнение из первого для исключения параметра </w:t>
-      </w:r>
-      <m:oMath>
-        <m:box>
-          <m:boxPr>
-            <m:ctrlPr>
-              <w:rPr>
-                <w:rFonts w:ascii="Cambria Math" w:hAnsi="Cambria Math"/>
-              </w:rPr>
-            </m:ctrlPr>
-          </m:boxPr>
-          <m:e>
-            <m:r>
-              <w:rPr>
-                <w:rFonts w:ascii="Cambria Math" w:hAnsi="Cambria Math"/>
-              </w:rPr>
-              <m:t>b</m:t>
-            </m:r>
-          </m:e>
-        </m:box>
-      </m:oMath>
-      <w:r>
-        <w:t>:</w:t>
+        <w:t>Вычитаем второе уравнение из первого:</w:t>
       </w:r>
     </w:p>
     <w:p>
@@ -9251,16 +8339,7 @@
                 <w:rPr>
                   <w:rFonts w:ascii="Cambria Math" w:hAnsi="Cambria Math"/>
                 </w:rPr>
-                <m:t>(14-5</m:t>
-              </m:r>
-              <m:r>
-                <m:rPr>
-                  <m:sty m:val="p"/>
-                </m:rPr>
-                <w:rPr>
-                  <w:rFonts w:ascii="Cambria Math" w:hAnsi="Cambria Math"/>
-                </w:rPr>
-                <m:t>)</m:t>
+                <m:t>(14-5)</m:t>
               </m:r>
               <m:r>
                 <w:rPr>
@@ -9443,7 +8522,7 @@
         <w:jc w:val="both"/>
       </w:pPr>
       <w:r>
-        <w:t xml:space="preserve">Проверяем условие существования и единственности решения: </w:t>
+        <w:t xml:space="preserve">Так как </w:t>
       </w:r>
       <m:oMath>
         <m:box>
@@ -9468,65 +8547,7 @@
         </m:box>
       </m:oMath>
       <w:r>
-        <w:t xml:space="preserve">. Сравнение имеет единственное решение в кольце </w:t>
-      </w:r>
-      <m:oMath>
-        <m:box>
-          <m:boxPr>
-            <m:ctrlPr>
-              <w:rPr>
-                <w:rFonts w:ascii="Cambria Math" w:hAnsi="Cambria Math"/>
-              </w:rPr>
-            </m:ctrlPr>
-          </m:boxPr>
-          <m:e>
-            <m:sSub>
-              <m:sSubPr>
-                <m:ctrlPr>
-                  <w:rPr>
-                    <w:rFonts w:ascii="Cambria Math" w:hAnsi="Cambria Math"/>
-                  </w:rPr>
-                </m:ctrlPr>
-              </m:sSubPr>
-              <m:e>
-                <m:r>
-                  <m:rPr>
-                    <m:scr m:val="double-struck"/>
-                  </m:rPr>
-                  <w:rPr>
-                    <w:rFonts w:ascii="Cambria Math" w:hAnsi="Cambria Math"/>
-                  </w:rPr>
-                  <m:t>Z</m:t>
-                </m:r>
-              </m:e>
-              <m:sub>
-                <m:box>
-                  <m:boxPr>
-                    <m:ctrlPr>
-                      <w:rPr>
-                        <w:rFonts w:ascii="Cambria Math" w:hAnsi="Cambria Math"/>
-                      </w:rPr>
-                    </m:ctrlPr>
-                  </m:boxPr>
-                  <m:e>
-                    <m:r>
-                      <m:rPr>
-                        <m:sty m:val="p"/>
-                      </m:rPr>
-                      <w:rPr>
-                        <w:rFonts w:ascii="Cambria Math" w:hAnsi="Cambria Math"/>
-                      </w:rPr>
-                      <m:t>32</m:t>
-                    </m:r>
-                  </m:e>
-                </m:box>
-              </m:sub>
-            </m:sSub>
-          </m:e>
-        </m:box>
-      </m:oMath>
-      <w:r>
-        <w:t xml:space="preserve">. Находим мультипликативно обратный элемент </w:t>
+        <w:t xml:space="preserve">, обратный элемент </w:t>
       </w:r>
       <m:oMath>
         <m:box>
@@ -9580,6 +8601,15 @@
                 </m:box>
               </m:sup>
             </m:sSup>
+            <m:r>
+              <m:rPr>
+                <m:sty m:val="p"/>
+              </m:rPr>
+              <w:rPr>
+                <w:rFonts w:ascii="Cambria Math" w:hAnsi="Cambria Math"/>
+              </w:rPr>
+              <m:t>≡-7≡25</m:t>
+            </m:r>
             <m:r>
               <m:rPr>
                 <m:nor/>
@@ -9647,7 +8677,7 @@
         </m:box>
       </m:oMath>
       <w:r>
-        <w:t xml:space="preserve"> с помощью расширенного алгоритма Евклида:</w:t>
+        <w:t>. Умножая на 25:</w:t>
       </w:r>
     </w:p>
     <w:p>
@@ -9668,36 +8698,11 @@
             </m:boxPr>
             <m:e>
               <m:r>
-                <m:rPr>
-                  <m:sty m:val="p"/>
-                </m:rPr>
                 <w:rPr>
                   <w:rFonts w:ascii="Cambria Math" w:hAnsi="Cambria Math"/>
                 </w:rPr>
-                <m:t>32=9·3+5</m:t>
+                <m:t>a</m:t>
               </m:r>
-            </m:e>
-          </m:box>
-        </m:oMath>
-      </m:oMathPara>
-    </w:p>
-    <w:p>
-      <w:pPr>
-        <w:spacing w:before="120" w:after="120"/>
-        <w:ind w:firstLine="0"/>
-        <w:jc w:val="center"/>
-      </w:pPr>
-      <m:oMathPara>
-        <m:oMath>
-          <m:box>
-            <m:boxPr>
-              <m:ctrlPr>
-                <w:rPr>
-                  <w:rFonts w:ascii="Cambria Math" w:hAnsi="Cambria Math"/>
-                </w:rPr>
-              </m:ctrlPr>
-            </m:boxPr>
-            <m:e>
               <m:r>
                 <m:rPr>
                   <m:sty m:val="p"/>
@@ -9705,181 +8710,7 @@
                 <w:rPr>
                   <w:rFonts w:ascii="Cambria Math" w:hAnsi="Cambria Math"/>
                 </w:rPr>
-                <m:t>9=5·1+4</m:t>
-              </m:r>
-            </m:e>
-          </m:box>
-        </m:oMath>
-      </m:oMathPara>
-    </w:p>
-    <w:p>
-      <w:pPr>
-        <w:spacing w:before="120" w:after="120"/>
-        <w:ind w:firstLine="0"/>
-        <w:jc w:val="center"/>
-      </w:pPr>
-      <m:oMathPara>
-        <m:oMath>
-          <m:box>
-            <m:boxPr>
-              <m:ctrlPr>
-                <w:rPr>
-                  <w:rFonts w:ascii="Cambria Math" w:hAnsi="Cambria Math"/>
-                </w:rPr>
-              </m:ctrlPr>
-            </m:boxPr>
-            <m:e>
-              <m:r>
-                <m:rPr>
-                  <m:sty m:val="p"/>
-                </m:rPr>
-                <w:rPr>
-                  <w:rFonts w:ascii="Cambria Math" w:hAnsi="Cambria Math"/>
-                </w:rPr>
-                <m:t>5=4·1+1</m:t>
-              </m:r>
-            </m:e>
-          </m:box>
-        </m:oMath>
-      </m:oMathPara>
-    </w:p>
-    <w:p>
-      <w:pPr>
-        <w:spacing w:before="120" w:after="120"/>
-        <w:ind w:firstLine="0"/>
-        <w:jc w:val="center"/>
-      </w:pPr>
-      <m:oMathPara>
-        <m:oMath>
-          <m:box>
-            <m:boxPr>
-              <m:ctrlPr>
-                <w:rPr>
-                  <w:rFonts w:ascii="Cambria Math" w:hAnsi="Cambria Math"/>
-                </w:rPr>
-              </m:ctrlPr>
-            </m:boxPr>
-            <m:e>
-              <m:r>
-                <m:rPr>
-                  <m:sty m:val="p"/>
-                </m:rPr>
-                <w:rPr>
-                  <w:rFonts w:ascii="Cambria Math" w:hAnsi="Cambria Math"/>
-                </w:rPr>
-                <m:t>1=5-4=5-(9-5)=2·5-9=2·(32-9·3)-9=2·32-7·9</m:t>
-              </m:r>
-            </m:e>
-          </m:box>
-        </m:oMath>
-      </m:oMathPara>
-    </w:p>
-    <w:p>
-      <w:pPr>
-        <w:jc w:val="both"/>
-      </w:pPr>
-      <w:r>
-        <w:t xml:space="preserve">Коэффициент Безу при числе 9 равен </w:t>
-      </w:r>
-      <m:oMath>
-        <m:box>
-          <m:boxPr>
-            <m:ctrlPr>
-              <w:rPr>
-                <w:rFonts w:ascii="Cambria Math" w:hAnsi="Cambria Math"/>
-              </w:rPr>
-            </m:ctrlPr>
-          </m:boxPr>
-          <m:e>
-            <m:r>
-              <w:rPr>
-                <w:rFonts w:ascii="Cambria Math" w:hAnsi="Cambria Math"/>
-              </w:rPr>
-              <m:t>u</m:t>
-            </m:r>
-            <m:r>
-              <m:rPr>
-                <m:sty m:val="p"/>
-              </m:rPr>
-              <w:rPr>
-                <w:rFonts w:ascii="Cambria Math" w:hAnsi="Cambria Math"/>
-              </w:rPr>
-              <m:t>=-7</m:t>
-            </m:r>
-          </m:e>
-        </m:box>
-      </m:oMath>
-      <w:r>
-        <w:t>. Приводим его к наименьшему положительному вычету по модулю 32:</w:t>
-      </w:r>
-    </w:p>
-    <w:p>
-      <w:pPr>
-        <w:spacing w:before="120" w:after="120"/>
-        <w:ind w:firstLine="0"/>
-        <w:jc w:val="center"/>
-      </w:pPr>
-      <m:oMathPara>
-        <m:oMath>
-          <m:box>
-            <m:boxPr>
-              <m:ctrlPr>
-                <w:rPr>
-                  <w:rFonts w:ascii="Cambria Math" w:hAnsi="Cambria Math"/>
-                </w:rPr>
-              </m:ctrlPr>
-            </m:boxPr>
-            <m:e>
-              <m:sSup>
-                <m:sSupPr>
-                  <m:ctrlPr>
-                    <w:rPr>
-                      <w:rFonts w:ascii="Cambria Math" w:hAnsi="Cambria Math"/>
-                    </w:rPr>
-                  </m:ctrlPr>
-                </m:sSupPr>
-                <m:e>
-                  <m:r>
-                    <m:rPr>
-                      <m:sty m:val="p"/>
-                    </m:rPr>
-                    <w:rPr>
-                      <w:rFonts w:ascii="Cambria Math" w:hAnsi="Cambria Math"/>
-                    </w:rPr>
-                    <m:t>9</m:t>
-                  </m:r>
-                </m:e>
-                <m:sup>
-                  <m:box>
-                    <m:boxPr>
-                      <m:ctrlPr>
-                        <w:rPr>
-                          <w:rFonts w:ascii="Cambria Math" w:hAnsi="Cambria Math"/>
-                        </w:rPr>
-                      </m:ctrlPr>
-                    </m:boxPr>
-                    <m:e>
-                      <m:r>
-                        <m:rPr>
-                          <m:sty m:val="p"/>
-                        </m:rPr>
-                        <w:rPr>
-                          <w:rFonts w:ascii="Cambria Math" w:hAnsi="Cambria Math"/>
-                        </w:rPr>
-                        <m:t>-1</m:t>
-                      </m:r>
-                    </m:e>
-                  </m:box>
-                </m:sup>
-              </m:sSup>
-              <m:r>
-                <m:rPr>
-                  <m:sty m:val="p"/>
-                </m:rPr>
-                <w:rPr>
-                  <w:rFonts w:ascii="Cambria Math" w:hAnsi="Cambria Math"/>
-                </w:rPr>
-                <m:t>≡-7≡25</m:t>
+                <m:t>≡25·27=675≡3</m:t>
               </m:r>
               <m:r>
                 <m:rPr>
@@ -9954,7 +8785,978 @@
         <w:jc w:val="both"/>
       </w:pPr>
       <w:r>
-        <w:t>Умножаем обе части исходного сравнения на 25:</w:t>
+        <w:t xml:space="preserve">Подставляем </w:t>
+      </w:r>
+      <m:oMath>
+        <m:box>
+          <m:boxPr>
+            <m:ctrlPr>
+              <w:rPr>
+                <w:rFonts w:ascii="Cambria Math" w:hAnsi="Cambria Math"/>
+              </w:rPr>
+            </m:ctrlPr>
+          </m:boxPr>
+          <m:e>
+            <m:r>
+              <w:rPr>
+                <w:rFonts w:ascii="Cambria Math" w:hAnsi="Cambria Math"/>
+              </w:rPr>
+              <m:t>a</m:t>
+            </m:r>
+            <m:r>
+              <m:rPr>
+                <m:sty m:val="p"/>
+              </m:rPr>
+              <w:rPr>
+                <w:rFonts w:ascii="Cambria Math" w:hAnsi="Cambria Math"/>
+              </w:rPr>
+              <m:t>=3</m:t>
+            </m:r>
+          </m:e>
+        </m:box>
+      </m:oMath>
+      <w:r>
+        <w:t xml:space="preserve"> во второе уравнение: </w:t>
+      </w:r>
+      <m:oMath>
+        <m:box>
+          <m:boxPr>
+            <m:ctrlPr>
+              <w:rPr>
+                <w:rFonts w:ascii="Cambria Math" w:hAnsi="Cambria Math"/>
+              </w:rPr>
+            </m:ctrlPr>
+          </m:boxPr>
+          <m:e>
+            <m:r>
+              <m:rPr>
+                <m:sty m:val="p"/>
+              </m:rPr>
+              <w:rPr>
+                <w:rFonts w:ascii="Cambria Math" w:hAnsi="Cambria Math"/>
+              </w:rPr>
+              <m:t>5·3+</m:t>
+            </m:r>
+            <m:r>
+              <w:rPr>
+                <w:rFonts w:ascii="Cambria Math" w:hAnsi="Cambria Math"/>
+              </w:rPr>
+              <m:t>b</m:t>
+            </m:r>
+            <m:r>
+              <m:rPr>
+                <m:sty m:val="p"/>
+              </m:rPr>
+              <w:rPr>
+                <w:rFonts w:ascii="Cambria Math" w:hAnsi="Cambria Math"/>
+              </w:rPr>
+              <m:t>≡12</m:t>
+            </m:r>
+            <m:r>
+              <w:rPr>
+                <w:rFonts w:ascii="Cambria Math" w:hAnsi="Cambria Math"/>
+              </w:rPr>
+              <m:t>⟹</m:t>
+            </m:r>
+            <m:r>
+              <m:rPr>
+                <m:sty m:val="p"/>
+              </m:rPr>
+              <w:rPr>
+                <w:rFonts w:ascii="Cambria Math" w:hAnsi="Cambria Math"/>
+              </w:rPr>
+              <m:t>15+</m:t>
+            </m:r>
+            <m:r>
+              <w:rPr>
+                <w:rFonts w:ascii="Cambria Math" w:hAnsi="Cambria Math"/>
+              </w:rPr>
+              <m:t>b</m:t>
+            </m:r>
+            <m:r>
+              <m:rPr>
+                <m:sty m:val="p"/>
+              </m:rPr>
+              <w:rPr>
+                <w:rFonts w:ascii="Cambria Math" w:hAnsi="Cambria Math"/>
+              </w:rPr>
+              <m:t>≡</m:t>
+            </m:r>
+            <m:r>
+              <m:rPr>
+                <m:sty m:val="p"/>
+              </m:rPr>
+              <w:rPr>
+                <w:rFonts w:ascii="Cambria Math" w:hAnsi="Cambria Math"/>
+              </w:rPr>
+              <m:t>12</m:t>
+            </m:r>
+            <m:r>
+              <w:rPr>
+                <w:rFonts w:ascii="Cambria Math" w:hAnsi="Cambria Math"/>
+              </w:rPr>
+              <m:t>⟹</m:t>
+            </m:r>
+            <m:r>
+              <w:rPr>
+                <w:rFonts w:ascii="Cambria Math" w:hAnsi="Cambria Math"/>
+              </w:rPr>
+              <m:t>b</m:t>
+            </m:r>
+            <m:r>
+              <m:rPr>
+                <m:sty m:val="p"/>
+              </m:rPr>
+              <w:rPr>
+                <w:rFonts w:ascii="Cambria Math" w:hAnsi="Cambria Math"/>
+              </w:rPr>
+              <m:t>≡-3≡29</m:t>
+            </m:r>
+            <m:r>
+              <m:rPr>
+                <m:nor/>
+              </m:rPr>
+              <m:t>   </m:t>
+            </m:r>
+            <m:d>
+              <m:dPr>
+                <m:ctrlPr>
+                  <w:rPr>
+                    <w:rFonts w:ascii="Cambria Math" w:hAnsi="Cambria Math"/>
+                  </w:rPr>
+                </m:ctrlPr>
+              </m:dPr>
+              <m:e>
+                <m:box>
+                  <m:boxPr>
+                    <m:ctrlPr>
+                      <w:rPr>
+                        <w:rFonts w:ascii="Cambria Math" w:hAnsi="Cambria Math"/>
+                      </w:rPr>
+                    </m:ctrlPr>
+                  </m:boxPr>
+                  <m:e>
+                    <m:r>
+                      <m:rPr>
+                        <m:sty m:val="p"/>
+                      </m:rPr>
+                      <w:rPr>
+                        <w:rFonts w:ascii="Cambria Math" w:hAnsi="Cambria Math"/>
+                      </w:rPr>
+                      <m:t>mod</m:t>
+                    </m:r>
+                    <m:r>
+                      <m:rPr>
+                        <m:nor/>
+                      </m:rPr>
+                      <m:t> </m:t>
+                    </m:r>
+                    <m:box>
+                      <m:boxPr>
+                        <m:ctrlPr>
+                          <w:rPr>
+                            <w:rFonts w:ascii="Cambria Math" w:hAnsi="Cambria Math"/>
+                          </w:rPr>
+                        </m:ctrlPr>
+                      </m:boxPr>
+                      <m:e>
+                        <m:r>
+                          <m:rPr>
+                            <m:sty m:val="p"/>
+                          </m:rPr>
+                          <w:rPr>
+                            <w:rFonts w:ascii="Cambria Math" w:hAnsi="Cambria Math"/>
+                          </w:rPr>
+                          <m:t>32</m:t>
+                        </m:r>
+                      </m:e>
+                    </m:box>
+                  </m:e>
+                </m:box>
+              </m:e>
+            </m:d>
+          </m:e>
+        </m:box>
+      </m:oMath>
+      <w:r>
+        <w:t xml:space="preserve">. Ключ </w:t>
+      </w:r>
+      <m:oMath>
+        <m:box>
+          <m:boxPr>
+            <m:ctrlPr>
+              <w:rPr>
+                <w:rFonts w:ascii="Cambria Math" w:hAnsi="Cambria Math"/>
+              </w:rPr>
+            </m:ctrlPr>
+          </m:boxPr>
+          <m:e>
+            <m:r>
+              <m:rPr>
+                <m:sty m:val="p"/>
+              </m:rPr>
+              <w:rPr>
+                <w:rFonts w:ascii="Cambria Math" w:hAnsi="Cambria Math"/>
+              </w:rPr>
+              <m:t>(</m:t>
+            </m:r>
+            <m:r>
+              <w:rPr>
+                <w:rFonts w:ascii="Cambria Math" w:hAnsi="Cambria Math"/>
+              </w:rPr>
+              <m:t>a</m:t>
+            </m:r>
+            <m:r>
+              <m:rPr>
+                <m:sty m:val="p"/>
+              </m:rPr>
+              <w:rPr>
+                <w:rFonts w:ascii="Cambria Math" w:hAnsi="Cambria Math"/>
+              </w:rPr>
+              <m:t>=3,</m:t>
+            </m:r>
+            <m:r>
+              <w:rPr>
+                <w:rFonts w:ascii="Cambria Math" w:hAnsi="Cambria Math"/>
+              </w:rPr>
+              <m:t>b</m:t>
+            </m:r>
+            <m:r>
+              <m:rPr>
+                <m:sty m:val="p"/>
+              </m:rPr>
+              <w:rPr>
+                <w:rFonts w:ascii="Cambria Math" w:hAnsi="Cambria Math"/>
+              </w:rPr>
+              <m:t>=29)</m:t>
+            </m:r>
+          </m:e>
+        </m:box>
+      </m:oMath>
+      <w:r>
+        <w:t xml:space="preserve"> является математически допустимым (</w:t>
+      </w:r>
+      <m:oMath>
+        <m:box>
+          <m:boxPr>
+            <m:ctrlPr>
+              <w:rPr>
+                <w:rFonts w:ascii="Cambria Math" w:hAnsi="Cambria Math"/>
+              </w:rPr>
+            </m:ctrlPr>
+          </m:boxPr>
+          <m:e>
+            <m:r>
+              <m:rPr>
+                <m:sty m:val="p"/>
+              </m:rPr>
+              <w:rPr>
+                <w:rFonts w:ascii="Cambria Math" w:hAnsi="Cambria Math"/>
+              </w:rPr>
+              <m:t>gcd(3,32)=1</m:t>
+            </m:r>
+          </m:e>
+        </m:box>
+      </m:oMath>
+      <w:r>
+        <w:t>), однако расшифрованный текст представляет собой бессмысленный набор букв.</w:t>
+      </w:r>
+    </w:p>
+    <w:p>
+      <w:pPr>
+        <w:ind w:left="425" w:firstLine="0"/>
+        <w:jc w:val="both"/>
+      </w:pPr>
+      <w:r>
+        <w:t xml:space="preserve">2. </w:t>
+      </w:r>
+      <w:r>
+        <w:rPr>
+          <w:b/>
+        </w:rPr>
+        <w:t>Последующие гипотезы</w:t>
+      </w:r>
+      <w:r>
+        <w:t xml:space="preserve"> </w:t>
+      </w:r>
+      <m:oMath>
+        <m:box>
+          <m:boxPr>
+            <m:ctrlPr>
+              <w:rPr>
+                <w:rFonts w:ascii="Cambria Math" w:hAnsi="Cambria Math"/>
+              </w:rPr>
+            </m:ctrlPr>
+          </m:boxPr>
+          <m:e>
+            <m:r>
+              <w:rPr>
+                <w:rFonts w:ascii="Cambria Math" w:hAnsi="Cambria Math"/>
+              </w:rPr>
+              <m:t>E</m:t>
+            </m:r>
+            <m:r>
+              <m:rPr>
+                <m:sty m:val="p"/>
+              </m:rPr>
+              <w:rPr>
+                <w:rFonts w:ascii="Cambria Math" w:hAnsi="Cambria Math"/>
+              </w:rPr>
+              <m:t>(</m:t>
+            </m:r>
+            <m:r>
+              <m:rPr>
+                <m:nor/>
+              </m:rPr>
+              <m:t>'о'</m:t>
+            </m:r>
+            <m:r>
+              <m:rPr>
+                <m:sty m:val="p"/>
+              </m:rPr>
+              <w:rPr>
+                <w:rFonts w:ascii="Cambria Math" w:hAnsi="Cambria Math"/>
+              </w:rPr>
+              <m:t>)=</m:t>
+            </m:r>
+            <m:r>
+              <m:rPr>
+                <m:nor/>
+              </m:rPr>
+              <m:t>'з'</m:t>
+            </m:r>
+            <m:r>
+              <m:rPr>
+                <m:sty m:val="p"/>
+              </m:rPr>
+              <w:rPr>
+                <w:rFonts w:ascii="Cambria Math" w:hAnsi="Cambria Math"/>
+              </w:rPr>
+              <m:t>,</m:t>
+            </m:r>
+            <m:r>
+              <w:rPr>
+                <w:rFonts w:ascii="Cambria Math" w:hAnsi="Cambria Math"/>
+              </w:rPr>
+              <m:t>E</m:t>
+            </m:r>
+            <m:r>
+              <m:rPr>
+                <m:sty m:val="p"/>
+              </m:rPr>
+              <w:rPr>
+                <w:rFonts w:ascii="Cambria Math" w:hAnsi="Cambria Math"/>
+              </w:rPr>
+              <m:t>(</m:t>
+            </m:r>
+            <m:r>
+              <m:rPr>
+                <m:nor/>
+              </m:rPr>
+              <m:t>'а'</m:t>
+            </m:r>
+            <m:r>
+              <m:rPr>
+                <m:sty m:val="p"/>
+              </m:rPr>
+              <w:rPr>
+                <w:rFonts w:ascii="Cambria Math" w:hAnsi="Cambria Math"/>
+              </w:rPr>
+              <m:t>)=</m:t>
+            </m:r>
+            <m:r>
+              <m:rPr>
+                <m:nor/>
+              </m:rPr>
+              <m:t>'м'</m:t>
+            </m:r>
+          </m:e>
+        </m:box>
+      </m:oMath>
+      <w:r>
+        <w:t xml:space="preserve"> (</w:t>
+      </w:r>
+      <m:oMath>
+        <m:box>
+          <m:boxPr>
+            <m:ctrlPr>
+              <w:rPr>
+                <w:rFonts w:ascii="Cambria Math" w:hAnsi="Cambria Math"/>
+              </w:rPr>
+            </m:ctrlPr>
+          </m:boxPr>
+          <m:e>
+            <m:r>
+              <m:rPr>
+                <m:sty m:val="p"/>
+              </m:rPr>
+              <w:rPr>
+                <w:rFonts w:ascii="Cambria Math" w:hAnsi="Cambria Math"/>
+              </w:rPr>
+              <m:t>9</m:t>
+            </m:r>
+            <m:r>
+              <w:rPr>
+                <w:rFonts w:ascii="Cambria Math" w:hAnsi="Cambria Math"/>
+              </w:rPr>
+              <m:t>a</m:t>
+            </m:r>
+            <m:r>
+              <m:rPr>
+                <m:sty m:val="p"/>
+              </m:rPr>
+              <w:rPr>
+                <w:rFonts w:ascii="Cambria Math" w:hAnsi="Cambria Math"/>
+              </w:rPr>
+              <m:t>≡…</m:t>
+            </m:r>
+          </m:e>
+        </m:box>
+      </m:oMath>
+      <w:r>
+        <w:t xml:space="preserve">), </w:t>
+      </w:r>
+      <m:oMath>
+        <m:box>
+          <m:boxPr>
+            <m:ctrlPr>
+              <w:rPr>
+                <w:rFonts w:ascii="Cambria Math" w:hAnsi="Cambria Math"/>
+              </w:rPr>
+            </m:ctrlPr>
+          </m:boxPr>
+          <m:e>
+            <m:r>
+              <w:rPr>
+                <w:rFonts w:ascii="Cambria Math" w:hAnsi="Cambria Math"/>
+              </w:rPr>
+              <m:t>E</m:t>
+            </m:r>
+            <m:r>
+              <m:rPr>
+                <m:sty m:val="p"/>
+              </m:rPr>
+              <w:rPr>
+                <w:rFonts w:ascii="Cambria Math" w:hAnsi="Cambria Math"/>
+              </w:rPr>
+              <m:t>(</m:t>
+            </m:r>
+            <m:r>
+              <m:rPr>
+                <m:nor/>
+              </m:rPr>
+              <m:t>'о'</m:t>
+            </m:r>
+            <m:r>
+              <m:rPr>
+                <m:sty m:val="p"/>
+              </m:rPr>
+              <w:rPr>
+                <w:rFonts w:ascii="Cambria Math" w:hAnsi="Cambria Math"/>
+              </w:rPr>
+              <m:t>)=</m:t>
+            </m:r>
+            <m:r>
+              <m:rPr>
+                <m:nor/>
+              </m:rPr>
+              <m:t>'з'</m:t>
+            </m:r>
+            <m:r>
+              <m:rPr>
+                <m:sty m:val="p"/>
+              </m:rPr>
+              <w:rPr>
+                <w:rFonts w:ascii="Cambria Math" w:hAnsi="Cambria Math"/>
+              </w:rPr>
+              <m:t>,</m:t>
+            </m:r>
+            <m:r>
+              <w:rPr>
+                <w:rFonts w:ascii="Cambria Math" w:hAnsi="Cambria Math"/>
+              </w:rPr>
+              <m:t>E</m:t>
+            </m:r>
+            <m:r>
+              <m:rPr>
+                <m:sty m:val="p"/>
+              </m:rPr>
+              <w:rPr>
+                <w:rFonts w:ascii="Cambria Math" w:hAnsi="Cambria Math"/>
+              </w:rPr>
+              <m:t>(</m:t>
+            </m:r>
+            <m:r>
+              <m:rPr>
+                <m:nor/>
+              </m:rPr>
+              <m:t>'и'</m:t>
+            </m:r>
+            <m:r>
+              <m:rPr>
+                <m:sty m:val="p"/>
+              </m:rPr>
+              <w:rPr>
+                <w:rFonts w:ascii="Cambria Math" w:hAnsi="Cambria Math"/>
+              </w:rPr>
+              <m:t>)=</m:t>
+            </m:r>
+            <m:r>
+              <m:rPr>
+                <m:nor/>
+              </m:rPr>
+              <m:t>'м'</m:t>
+            </m:r>
+          </m:e>
+        </m:box>
+      </m:oMath>
+      <w:r>
+        <w:t xml:space="preserve"> и </w:t>
+      </w:r>
+      <m:oMath>
+        <m:box>
+          <m:boxPr>
+            <m:ctrlPr>
+              <w:rPr>
+                <w:rFonts w:ascii="Cambria Math" w:hAnsi="Cambria Math"/>
+              </w:rPr>
+            </m:ctrlPr>
+          </m:boxPr>
+          <m:e>
+            <m:r>
+              <w:rPr>
+                <w:rFonts w:ascii="Cambria Math" w:hAnsi="Cambria Math"/>
+              </w:rPr>
+              <m:t>E</m:t>
+            </m:r>
+            <m:r>
+              <m:rPr>
+                <m:sty m:val="p"/>
+              </m:rPr>
+              <w:rPr>
+                <w:rFonts w:ascii="Cambria Math" w:hAnsi="Cambria Math"/>
+              </w:rPr>
+              <m:t>(</m:t>
+            </m:r>
+            <m:r>
+              <m:rPr>
+                <m:nor/>
+              </m:rPr>
+              <m:t>'о'</m:t>
+            </m:r>
+            <m:r>
+              <m:rPr>
+                <m:sty m:val="p"/>
+              </m:rPr>
+              <w:rPr>
+                <w:rFonts w:ascii="Cambria Math" w:hAnsi="Cambria Math"/>
+              </w:rPr>
+              <m:t>)=</m:t>
+            </m:r>
+            <m:r>
+              <m:rPr>
+                <m:nor/>
+              </m:rPr>
+              <m:t>'з'</m:t>
+            </m:r>
+            <m:r>
+              <m:rPr>
+                <m:sty m:val="p"/>
+              </m:rPr>
+              <w:rPr>
+                <w:rFonts w:ascii="Cambria Math" w:hAnsi="Cambria Math"/>
+              </w:rPr>
+              <m:t>,</m:t>
+            </m:r>
+            <m:r>
+              <w:rPr>
+                <w:rFonts w:ascii="Cambria Math" w:hAnsi="Cambria Math"/>
+              </w:rPr>
+              <m:t>E</m:t>
+            </m:r>
+            <m:r>
+              <m:rPr>
+                <m:sty m:val="p"/>
+              </m:rPr>
+              <w:rPr>
+                <w:rFonts w:ascii="Cambria Math" w:hAnsi="Cambria Math"/>
+              </w:rPr>
+              <m:t>(</m:t>
+            </m:r>
+            <m:r>
+              <m:rPr>
+                <m:nor/>
+              </m:rPr>
+              <m:t>'т'</m:t>
+            </m:r>
+            <m:r>
+              <m:rPr>
+                <m:sty m:val="p"/>
+              </m:rPr>
+              <w:rPr>
+                <w:rFonts w:ascii="Cambria Math" w:hAnsi="Cambria Math"/>
+              </w:rPr>
+              <m:t>)=</m:t>
+            </m:r>
+            <m:r>
+              <m:rPr>
+                <m:nor/>
+              </m:rPr>
+              <m:t>'м'</m:t>
+            </m:r>
+          </m:e>
+        </m:box>
+      </m:oMath>
+      <w:r>
+        <w:t xml:space="preserve"> приводят к несовместным сравнениям (разность </w:t>
+      </w:r>
+      <m:oMath>
+        <m:box>
+          <m:boxPr>
+            <m:ctrlPr>
+              <w:rPr>
+                <w:rFonts w:ascii="Cambria Math" w:hAnsi="Cambria Math"/>
+              </w:rPr>
+            </m:ctrlPr>
+          </m:boxPr>
+          <m:e>
+            <m:r>
+              <w:rPr>
+                <w:rFonts w:ascii="Cambria Math" w:hAnsi="Cambria Math"/>
+              </w:rPr>
+              <m:t>Δy</m:t>
+            </m:r>
+          </m:e>
+        </m:box>
+      </m:oMath>
+      <w:r>
+        <w:t xml:space="preserve"> не делится на </w:t>
+      </w:r>
+      <m:oMath>
+        <m:box>
+          <m:boxPr>
+            <m:ctrlPr>
+              <w:rPr>
+                <w:rFonts w:ascii="Cambria Math" w:hAnsi="Cambria Math"/>
+              </w:rPr>
+            </m:ctrlPr>
+          </m:boxPr>
+          <m:e>
+            <m:r>
+              <m:rPr>
+                <m:sty m:val="p"/>
+              </m:rPr>
+              <w:rPr>
+                <w:rFonts w:ascii="Cambria Math" w:hAnsi="Cambria Math"/>
+              </w:rPr>
+              <m:t>gcd(</m:t>
+            </m:r>
+            <m:r>
+              <w:rPr>
+                <w:rFonts w:ascii="Cambria Math" w:hAnsi="Cambria Math"/>
+              </w:rPr>
+              <m:t>Δx</m:t>
+            </m:r>
+            <m:r>
+              <m:rPr>
+                <m:sty m:val="p"/>
+              </m:rPr>
+              <w:rPr>
+                <w:rFonts w:ascii="Cambria Math" w:hAnsi="Cambria Math"/>
+              </w:rPr>
+              <m:t>,32)</m:t>
+            </m:r>
+          </m:e>
+        </m:box>
+      </m:oMath>
+      <w:r>
+        <w:t>).</w:t>
+      </w:r>
+    </w:p>
+    <w:p>
+      <w:pPr>
+        <w:ind w:left="425" w:firstLine="0"/>
+        <w:jc w:val="both"/>
+      </w:pPr>
+      <w:r>
+        <w:t xml:space="preserve">3. </w:t>
+      </w:r>
+      <w:r>
+        <w:rPr>
+          <w:b/>
+        </w:rPr>
+        <w:t>Истинная гипотеза (5-я по порядку):</w:t>
+      </w:r>
+      <w:r>
+        <w:t xml:space="preserve"> сопоставление </w:t>
+      </w:r>
+      <m:oMath>
+        <m:box>
+          <m:boxPr>
+            <m:ctrlPr>
+              <w:rPr>
+                <w:rFonts w:ascii="Cambria Math" w:hAnsi="Cambria Math"/>
+              </w:rPr>
+            </m:ctrlPr>
+          </m:boxPr>
+          <m:e>
+            <m:r>
+              <w:rPr>
+                <w:rFonts w:ascii="Cambria Math" w:hAnsi="Cambria Math"/>
+              </w:rPr>
+              <m:t>E</m:t>
+            </m:r>
+            <m:r>
+              <m:rPr>
+                <m:sty m:val="p"/>
+              </m:rPr>
+              <w:rPr>
+                <w:rFonts w:ascii="Cambria Math" w:hAnsi="Cambria Math"/>
+              </w:rPr>
+              <m:t>(</m:t>
+            </m:r>
+            <m:r>
+              <m:rPr>
+                <m:nor/>
+              </m:rPr>
+              <m:t>'о'</m:t>
+            </m:r>
+            <m:r>
+              <m:rPr>
+                <m:sty m:val="p"/>
+              </m:rPr>
+              <w:rPr>
+                <w:rFonts w:ascii="Cambria Math" w:hAnsi="Cambria Math"/>
+              </w:rPr>
+              <m:t>)=</m:t>
+            </m:r>
+            <m:r>
+              <m:rPr>
+                <m:nor/>
+              </m:rPr>
+              <m:t>'з'</m:t>
+            </m:r>
+          </m:e>
+        </m:box>
+      </m:oMath>
+      <w:r>
+        <w:t xml:space="preserve"> и </w:t>
+      </w:r>
+      <m:oMath>
+        <m:box>
+          <m:boxPr>
+            <m:ctrlPr>
+              <w:rPr>
+                <w:rFonts w:ascii="Cambria Math" w:hAnsi="Cambria Math"/>
+              </w:rPr>
+            </m:ctrlPr>
+          </m:boxPr>
+          <m:e>
+            <m:r>
+              <w:rPr>
+                <w:rFonts w:ascii="Cambria Math" w:hAnsi="Cambria Math"/>
+              </w:rPr>
+              <m:t>E</m:t>
+            </m:r>
+            <m:r>
+              <m:rPr>
+                <m:sty m:val="p"/>
+              </m:rPr>
+              <w:rPr>
+                <w:rFonts w:ascii="Cambria Math" w:hAnsi="Cambria Math"/>
+              </w:rPr>
+              <m:t>(</m:t>
+            </m:r>
+            <m:r>
+              <m:rPr>
+                <m:nor/>
+              </m:rPr>
+              <m:t>'н'</m:t>
+            </m:r>
+            <m:r>
+              <m:rPr>
+                <m:sty m:val="p"/>
+              </m:rPr>
+              <w:rPr>
+                <w:rFonts w:ascii="Cambria Math" w:hAnsi="Cambria Math"/>
+              </w:rPr>
+              <m:t>)=</m:t>
+            </m:r>
+            <m:r>
+              <m:rPr>
+                <m:nor/>
+              </m:rPr>
+              <m:t>'м'</m:t>
+            </m:r>
+          </m:e>
+        </m:box>
+      </m:oMath>
+      <w:r>
+        <w:t xml:space="preserve"> (</w:t>
+      </w:r>
+      <m:oMath>
+        <m:box>
+          <m:boxPr>
+            <m:ctrlPr>
+              <w:rPr>
+                <w:rFonts w:ascii="Cambria Math" w:hAnsi="Cambria Math"/>
+              </w:rPr>
+            </m:ctrlPr>
+          </m:boxPr>
+          <m:e>
+            <m:sSub>
+              <m:sSubPr>
+                <m:ctrlPr>
+                  <w:rPr>
+                    <w:rFonts w:ascii="Cambria Math" w:hAnsi="Cambria Math"/>
+                  </w:rPr>
+                </m:ctrlPr>
+              </m:sSubPr>
+              <m:e>
+                <m:r>
+                  <w:rPr>
+                    <w:rFonts w:ascii="Cambria Math" w:hAnsi="Cambria Math"/>
+                  </w:rPr>
+                  <m:t>x</m:t>
+                </m:r>
+              </m:e>
+              <m:sub>
+                <m:r>
+                  <m:rPr>
+                    <m:sty m:val="p"/>
+                  </m:rPr>
+                  <w:rPr>
+                    <w:rFonts w:ascii="Cambria Math" w:hAnsi="Cambria Math"/>
+                  </w:rPr>
+                  <m:t>1</m:t>
+                </m:r>
+              </m:sub>
+            </m:sSub>
+            <m:r>
+              <m:rPr>
+                <m:sty m:val="p"/>
+              </m:rPr>
+              <w:rPr>
+                <w:rFonts w:ascii="Cambria Math" w:hAnsi="Cambria Math"/>
+              </w:rPr>
+              <m:t>=14,</m:t>
+            </m:r>
+            <m:sSub>
+              <m:sSubPr>
+                <m:ctrlPr>
+                  <w:rPr>
+                    <w:rFonts w:ascii="Cambria Math" w:hAnsi="Cambria Math"/>
+                  </w:rPr>
+                </m:ctrlPr>
+              </m:sSubPr>
+              <m:e>
+                <m:r>
+                  <w:rPr>
+                    <w:rFonts w:ascii="Cambria Math" w:hAnsi="Cambria Math"/>
+                  </w:rPr>
+                  <m:t>y</m:t>
+                </m:r>
+              </m:e>
+              <m:sub>
+                <m:r>
+                  <m:rPr>
+                    <m:sty m:val="p"/>
+                  </m:rPr>
+                  <w:rPr>
+                    <w:rFonts w:ascii="Cambria Math" w:hAnsi="Cambria Math"/>
+                  </w:rPr>
+                  <m:t>1</m:t>
+                </m:r>
+              </m:sub>
+            </m:sSub>
+            <m:r>
+              <m:rPr>
+                <m:sty m:val="p"/>
+              </m:rPr>
+              <w:rPr>
+                <w:rFonts w:ascii="Cambria Math" w:hAnsi="Cambria Math"/>
+              </w:rPr>
+              <m:t>=7,</m:t>
+            </m:r>
+            <m:sSub>
+              <m:sSubPr>
+                <m:ctrlPr>
+                  <w:rPr>
+                    <w:rFonts w:ascii="Cambria Math" w:hAnsi="Cambria Math"/>
+                  </w:rPr>
+                </m:ctrlPr>
+              </m:sSubPr>
+              <m:e>
+                <m:r>
+                  <w:rPr>
+                    <w:rFonts w:ascii="Cambria Math" w:hAnsi="Cambria Math"/>
+                  </w:rPr>
+                  <m:t>x</m:t>
+                </m:r>
+              </m:e>
+              <m:sub>
+                <m:r>
+                  <m:rPr>
+                    <m:sty m:val="p"/>
+                  </m:rPr>
+                  <w:rPr>
+                    <w:rFonts w:ascii="Cambria Math" w:hAnsi="Cambria Math"/>
+                  </w:rPr>
+                  <m:t>2</m:t>
+                </m:r>
+              </m:sub>
+            </m:sSub>
+            <m:r>
+              <m:rPr>
+                <m:sty m:val="p"/>
+              </m:rPr>
+              <w:rPr>
+                <w:rFonts w:ascii="Cambria Math" w:hAnsi="Cambria Math"/>
+              </w:rPr>
+              <m:t>=13,</m:t>
+            </m:r>
+            <m:sSub>
+              <m:sSubPr>
+                <m:ctrlPr>
+                  <w:rPr>
+                    <w:rFonts w:ascii="Cambria Math" w:hAnsi="Cambria Math"/>
+                  </w:rPr>
+                </m:ctrlPr>
+              </m:sSubPr>
+              <m:e>
+                <m:r>
+                  <w:rPr>
+                    <w:rFonts w:ascii="Cambria Math" w:hAnsi="Cambria Math"/>
+                  </w:rPr>
+                  <m:t>y</m:t>
+                </m:r>
+              </m:e>
+              <m:sub>
+                <m:r>
+                  <m:rPr>
+                    <m:sty m:val="p"/>
+                  </m:rPr>
+                  <w:rPr>
+                    <w:rFonts w:ascii="Cambria Math" w:hAnsi="Cambria Math"/>
+                  </w:rPr>
+                  <m:t>2</m:t>
+                </m:r>
+              </m:sub>
+            </m:sSub>
+            <m:r>
+              <m:rPr>
+                <m:sty m:val="p"/>
+              </m:rPr>
+              <w:rPr>
+                <w:rFonts w:ascii="Cambria Math" w:hAnsi="Cambria Math"/>
+              </w:rPr>
+              <m:t>=12</m:t>
+            </m:r>
+          </m:e>
+        </m:box>
+      </m:oMath>
+      <w:r>
+        <w:t>):</w:t>
       </w:r>
     </w:p>
     <w:p>
@@ -9974,6 +9776,331 @@
               </m:ctrlPr>
             </m:boxPr>
             <m:e>
+              <m:box>
+                <m:boxPr>
+                  <m:ctrlPr>
+                    <w:rPr>
+                      <w:rFonts w:ascii="Cambria Math" w:hAnsi="Cambria Math"/>
+                    </w:rPr>
+                  </m:ctrlPr>
+                </m:boxPr>
+                <m:e>
+                  <m:d>
+                    <m:dPr>
+                      <m:begChr m:val="{"/>
+                      <m:endChr m:val=""/>
+                      <m:ctrlPr>
+                        <w:rPr>
+                          <w:rFonts w:ascii="Cambria Math" w:hAnsi="Cambria Math"/>
+                        </w:rPr>
+                      </m:ctrlPr>
+                    </m:dPr>
+                    <m:e>
+                      <m:box>
+                        <m:boxPr>
+                          <m:ctrlPr>
+                            <w:rPr>
+                              <w:rFonts w:ascii="Cambria Math" w:hAnsi="Cambria Math"/>
+                            </w:rPr>
+                          </m:ctrlPr>
+                        </m:boxPr>
+                        <m:e>
+                          <m:m>
+                            <m:mPr>
+                              <m:mcs>
+                                <m:mc>
+                                  <m:mcPr>
+                                    <m:count m:val="1"/>
+                                    <m:mcJc m:val="center"/>
+                                  </m:mcPr>
+                                </m:mc>
+                              </m:mcs>
+                              <m:ctrlPr>
+                                <w:rPr>
+                                  <w:rFonts w:ascii="Cambria Math" w:hAnsi="Cambria Math"/>
+                                </w:rPr>
+                              </m:ctrlPr>
+                            </m:mPr>
+                            <m:mr>
+                              <m:e>
+                                <m:box>
+                                  <m:boxPr>
+                                    <m:ctrlPr>
+                                      <w:rPr>
+                                        <w:rFonts w:ascii="Cambria Math" w:hAnsi="Cambria Math"/>
+                                      </w:rPr>
+                                    </m:ctrlPr>
+                                  </m:boxPr>
+                                  <m:e>
+                                    <m:r>
+                                      <m:rPr>
+                                        <m:sty m:val="p"/>
+                                      </m:rPr>
+                                      <w:rPr>
+                                        <w:rFonts w:ascii="Cambria Math" w:hAnsi="Cambria Math"/>
+                                      </w:rPr>
+                                      <m:t>14</m:t>
+                                    </m:r>
+                                    <m:r>
+                                      <w:rPr>
+                                        <w:rFonts w:ascii="Cambria Math" w:hAnsi="Cambria Math"/>
+                                      </w:rPr>
+                                      <m:t>a</m:t>
+                                    </m:r>
+                                    <m:r>
+                                      <m:rPr>
+                                        <m:sty m:val="p"/>
+                                      </m:rPr>
+                                      <w:rPr>
+                                        <w:rFonts w:ascii="Cambria Math" w:hAnsi="Cambria Math"/>
+                                      </w:rPr>
+                                      <m:t>+</m:t>
+                                    </m:r>
+                                    <m:r>
+                                      <w:rPr>
+                                        <w:rFonts w:ascii="Cambria Math" w:hAnsi="Cambria Math"/>
+                                      </w:rPr>
+                                      <m:t>b</m:t>
+                                    </m:r>
+                                    <m:r>
+                                      <m:rPr>
+                                        <m:sty m:val="p"/>
+                                      </m:rPr>
+                                      <w:rPr>
+                                        <w:rFonts w:ascii="Cambria Math" w:hAnsi="Cambria Math"/>
+                                      </w:rPr>
+                                      <m:t>≡7</m:t>
+                                    </m:r>
+                                    <m:r>
+                                      <m:rPr>
+                                        <m:nor/>
+                                      </m:rPr>
+                                      <m:t>   </m:t>
+                                    </m:r>
+                                    <m:d>
+                                      <m:dPr>
+                                        <m:ctrlPr>
+                                          <w:rPr>
+                                            <w:rFonts w:ascii="Cambria Math" w:hAnsi="Cambria Math"/>
+                                          </w:rPr>
+                                        </m:ctrlPr>
+                                      </m:dPr>
+                                      <m:e>
+                                        <m:box>
+                                          <m:boxPr>
+                                            <m:ctrlPr>
+                                              <w:rPr>
+                                                <w:rFonts w:ascii="Cambria Math" w:hAnsi="Cambria Math"/>
+                                              </w:rPr>
+                                            </m:ctrlPr>
+                                          </m:boxPr>
+                                          <m:e>
+                                            <m:r>
+                                              <m:rPr>
+                                                <m:sty m:val="p"/>
+                                              </m:rPr>
+                                              <w:rPr>
+                                                <w:rFonts w:ascii="Cambria Math" w:hAnsi="Cambria Math"/>
+                                              </w:rPr>
+                                              <m:t>mod</m:t>
+                                            </m:r>
+                                            <m:r>
+                                              <m:rPr>
+                                                <m:nor/>
+                                              </m:rPr>
+                                              <m:t> </m:t>
+                                            </m:r>
+                                            <m:box>
+                                              <m:boxPr>
+                                                <m:ctrlPr>
+                                                  <w:rPr>
+                                                    <w:rFonts w:ascii="Cambria Math" w:hAnsi="Cambria Math"/>
+                                                  </w:rPr>
+                                                </m:ctrlPr>
+                                              </m:boxPr>
+                                              <m:e>
+                                                <m:r>
+                                                  <m:rPr>
+                                                    <m:sty m:val="p"/>
+                                                  </m:rPr>
+                                                  <w:rPr>
+                                                    <w:rFonts w:ascii="Cambria Math" w:hAnsi="Cambria Math"/>
+                                                  </w:rPr>
+                                                  <m:t>32</m:t>
+                                                </m:r>
+                                              </m:e>
+                                            </m:box>
+                                          </m:e>
+                                        </m:box>
+                                      </m:e>
+                                    </m:d>
+                                  </m:e>
+                                </m:box>
+                              </m:e>
+                            </m:mr>
+                            <m:mr>
+                              <m:e>
+                                <m:box>
+                                  <m:boxPr>
+                                    <m:ctrlPr>
+                                      <w:rPr>
+                                        <w:rFonts w:ascii="Cambria Math" w:hAnsi="Cambria Math"/>
+                                      </w:rPr>
+                                    </m:ctrlPr>
+                                  </m:boxPr>
+                                  <m:e>
+                                    <m:r>
+                                      <m:rPr>
+                                        <m:sty m:val="p"/>
+                                      </m:rPr>
+                                      <w:rPr>
+                                        <w:rFonts w:ascii="Cambria Math" w:hAnsi="Cambria Math"/>
+                                      </w:rPr>
+                                      <m:t>13</m:t>
+                                    </m:r>
+                                    <m:r>
+                                      <w:rPr>
+                                        <w:rFonts w:ascii="Cambria Math" w:hAnsi="Cambria Math"/>
+                                      </w:rPr>
+                                      <m:t>a</m:t>
+                                    </m:r>
+                                    <m:r>
+                                      <m:rPr>
+                                        <m:sty m:val="p"/>
+                                      </m:rPr>
+                                      <w:rPr>
+                                        <w:rFonts w:ascii="Cambria Math" w:hAnsi="Cambria Math"/>
+                                      </w:rPr>
+                                      <m:t>+</m:t>
+                                    </m:r>
+                                    <m:r>
+                                      <w:rPr>
+                                        <w:rFonts w:ascii="Cambria Math" w:hAnsi="Cambria Math"/>
+                                      </w:rPr>
+                                      <m:t>b</m:t>
+                                    </m:r>
+                                    <m:r>
+                                      <m:rPr>
+                                        <m:sty m:val="p"/>
+                                      </m:rPr>
+                                      <w:rPr>
+                                        <w:rFonts w:ascii="Cambria Math" w:hAnsi="Cambria Math"/>
+                                      </w:rPr>
+                                      <m:t>≡12</m:t>
+                                    </m:r>
+                                    <m:r>
+                                      <m:rPr>
+                                        <m:nor/>
+                                      </m:rPr>
+                                      <m:t>   </m:t>
+                                    </m:r>
+                                    <m:d>
+                                      <m:dPr>
+                                        <m:ctrlPr>
+                                          <w:rPr>
+                                            <w:rFonts w:ascii="Cambria Math" w:hAnsi="Cambria Math"/>
+                                          </w:rPr>
+                                        </m:ctrlPr>
+                                      </m:dPr>
+                                      <m:e>
+                                        <m:box>
+                                          <m:boxPr>
+                                            <m:ctrlPr>
+                                              <w:rPr>
+                                                <w:rFonts w:ascii="Cambria Math" w:hAnsi="Cambria Math"/>
+                                              </w:rPr>
+                                            </m:ctrlPr>
+                                          </m:boxPr>
+                                          <m:e>
+                                            <m:r>
+                                              <m:rPr>
+                                                <m:sty m:val="p"/>
+                                              </m:rPr>
+                                              <w:rPr>
+                                                <w:rFonts w:ascii="Cambria Math" w:hAnsi="Cambria Math"/>
+                                              </w:rPr>
+                                              <m:t>mod</m:t>
+                                            </m:r>
+                                            <m:r>
+                                              <m:rPr>
+                                                <m:nor/>
+                                              </m:rPr>
+                                              <m:t> </m:t>
+                                            </m:r>
+                                            <m:box>
+                                              <m:boxPr>
+                                                <m:ctrlPr>
+                                                  <w:rPr>
+                                                    <w:rFonts w:ascii="Cambria Math" w:hAnsi="Cambria Math"/>
+                                                  </w:rPr>
+                                                </m:ctrlPr>
+                                              </m:boxPr>
+                                              <m:e>
+                                                <m:r>
+                                                  <m:rPr>
+                                                    <m:sty m:val="p"/>
+                                                  </m:rPr>
+                                                  <w:rPr>
+                                                    <w:rFonts w:ascii="Cambria Math" w:hAnsi="Cambria Math"/>
+                                                  </w:rPr>
+                                                  <m:t>32</m:t>
+                                                </m:r>
+                                              </m:e>
+                                            </m:box>
+                                          </m:e>
+                                        </m:box>
+                                      </m:e>
+                                    </m:d>
+                                  </m:e>
+                                </m:box>
+                              </m:e>
+                            </m:mr>
+                          </m:m>
+                        </m:e>
+                      </m:box>
+                    </m:e>
+                  </m:d>
+                </m:e>
+              </m:box>
+            </m:e>
+          </m:box>
+        </m:oMath>
+      </m:oMathPara>
+    </w:p>
+    <w:p>
+      <w:pPr>
+        <w:jc w:val="both"/>
+      </w:pPr>
+      <w:r>
+        <w:t>Вычитаем второе уравнение из первого:</w:t>
+      </w:r>
+    </w:p>
+    <w:p>
+      <w:pPr>
+        <w:spacing w:before="120" w:after="120"/>
+        <w:ind w:firstLine="0"/>
+        <w:jc w:val="center"/>
+      </w:pPr>
+      <m:oMathPara>
+        <m:oMath>
+          <m:box>
+            <m:boxPr>
+              <m:ctrlPr>
+                <w:rPr>
+                  <w:rFonts w:ascii="Cambria Math" w:hAnsi="Cambria Math"/>
+                </w:rPr>
+              </m:ctrlPr>
+            </m:boxPr>
+            <m:e>
+              <m:r>
+                <m:rPr>
+                  <m:sty m:val="p"/>
+                </m:rPr>
+                <w:rPr>
+                  <w:rFonts w:ascii="Cambria Math" w:hAnsi="Cambria Math"/>
+                </w:rPr>
+                <m:t>(14-13)</m:t>
+              </m:r>
               <m:r>
                 <w:rPr>
                   <w:rFonts w:ascii="Cambria Math" w:hAnsi="Cambria Math"/>
@@ -9987,7 +10114,7 @@
                 <w:rPr>
                   <w:rFonts w:ascii="Cambria Math" w:hAnsi="Cambria Math"/>
                 </w:rPr>
-                <m:t>≡25·27=675≡27</m:t>
+                <m:t>≡(7-12)</m:t>
               </m:r>
               <m:r>
                 <m:rPr>
@@ -10052,6 +10179,120 @@
                   </m:box>
                 </m:e>
               </m:d>
+              <m:r>
+                <w:rPr>
+                  <w:rFonts w:ascii="Cambria Math" w:hAnsi="Cambria Math"/>
+                </w:rPr>
+                <m:t>⟺</m:t>
+              </m:r>
+              <m:r>
+                <m:rPr>
+                  <m:sty m:val="p"/>
+                </m:rPr>
+                <w:rPr>
+                  <w:rFonts w:ascii="Cambria Math" w:hAnsi="Cambria Math"/>
+                </w:rPr>
+                <m:t>1</m:t>
+              </m:r>
+              <m:r>
+                <w:rPr>
+                  <w:rFonts w:ascii="Cambria Math" w:hAnsi="Cambria Math"/>
+                </w:rPr>
+                <m:t>a</m:t>
+              </m:r>
+              <m:r>
+                <m:rPr>
+                  <m:sty m:val="p"/>
+                </m:rPr>
+                <w:rPr>
+                  <w:rFonts w:ascii="Cambria Math" w:hAnsi="Cambria Math"/>
+                </w:rPr>
+                <m:t>≡-5≡27</m:t>
+              </m:r>
+              <m:r>
+                <m:rPr>
+                  <m:nor/>
+                </m:rPr>
+                <m:t>   </m:t>
+              </m:r>
+              <m:d>
+                <m:dPr>
+                  <m:ctrlPr>
+                    <w:rPr>
+                      <w:rFonts w:ascii="Cambria Math" w:hAnsi="Cambria Math"/>
+                    </w:rPr>
+                  </m:ctrlPr>
+                </m:dPr>
+                <m:e>
+                  <m:box>
+                    <m:boxPr>
+                      <m:ctrlPr>
+                        <w:rPr>
+                          <w:rFonts w:ascii="Cambria Math" w:hAnsi="Cambria Math"/>
+                        </w:rPr>
+                      </m:ctrlPr>
+                    </m:boxPr>
+                    <m:e>
+                      <m:r>
+                        <m:rPr>
+                          <m:sty m:val="p"/>
+                        </m:rPr>
+                        <w:rPr>
+                          <w:rFonts w:ascii="Cambria Math" w:hAnsi="Cambria Math"/>
+                        </w:rPr>
+                        <m:t>mod</m:t>
+                      </m:r>
+                      <m:r>
+                        <m:rPr>
+                          <m:nor/>
+                        </m:rPr>
+                        <m:t> </m:t>
+                      </m:r>
+                      <m:box>
+                        <m:boxPr>
+                          <m:ctrlPr>
+                            <w:rPr>
+                              <w:rFonts w:ascii="Cambria Math" w:hAnsi="Cambria Math"/>
+                            </w:rPr>
+                          </m:ctrlPr>
+                        </m:boxPr>
+                        <m:e>
+                          <m:r>
+                            <m:rPr>
+                              <m:sty m:val="p"/>
+                            </m:rPr>
+                            <w:rPr>
+                              <w:rFonts w:ascii="Cambria Math" w:hAnsi="Cambria Math"/>
+                            </w:rPr>
+                            <m:t>32</m:t>
+                          </m:r>
+                        </m:e>
+                      </m:box>
+                    </m:e>
+                  </m:box>
+                </m:e>
+              </m:d>
+              <m:r>
+                <w:rPr>
+                  <w:rFonts w:ascii="Cambria Math" w:hAnsi="Cambria Math"/>
+                </w:rPr>
+                <m:t>⟹</m:t>
+              </m:r>
+              <m:r>
+                <w:rPr>
+                  <w:rFonts w:ascii="Cambria Math" w:hAnsi="Cambria Math"/>
+                </w:rPr>
+                <m:t>a</m:t>
+              </m:r>
+              <m:r>
+                <m:rPr>
+                  <m:sty m:val="p"/>
+                </m:rPr>
+                <w:rPr>
+                  <w:rFonts w:ascii="Cambria Math" w:hAnsi="Cambria Math"/>
+                </w:rPr>
+                <m:t>=27</m:t>
+              </m:r>
             </m:e>
           </m:box>
         </m:oMath>
@@ -10062,7 +10303,7 @@
         <w:jc w:val="both"/>
       </w:pPr>
       <w:r>
-        <w:t xml:space="preserve">Подставляем найденное значение </w:t>
+        <w:t xml:space="preserve">Подставляем </w:t>
       </w:r>
       <m:oMath>
         <m:box>
@@ -10093,29 +10334,7 @@
         </m:box>
       </m:oMath>
       <w:r>
-        <w:t xml:space="preserve"> во второе уравнение системы для определения сдвигового коэффициента </w:t>
-      </w:r>
-      <m:oMath>
-        <m:box>
-          <m:boxPr>
-            <m:ctrlPr>
-              <w:rPr>
-                <w:rFonts w:ascii="Cambria Math" w:hAnsi="Cambria Math"/>
-              </w:rPr>
-            </m:ctrlPr>
-          </m:boxPr>
-          <m:e>
-            <m:r>
-              <w:rPr>
-                <w:rFonts w:ascii="Cambria Math" w:hAnsi="Cambria Math"/>
-              </w:rPr>
-              <m:t>b</m:t>
-            </m:r>
-          </m:e>
-        </m:box>
-      </m:oMath>
-      <w:r>
-        <w:t>:</w:t>
+        <w:t xml:space="preserve"> в первое уравнение:</w:t>
       </w:r>
     </w:p>
     <w:p>
@@ -10142,7 +10361,7 @@
                 <w:rPr>
                   <w:rFonts w:ascii="Cambria Math" w:hAnsi="Cambria Math"/>
                 </w:rPr>
-                <m:t>5·27+</m:t>
+                <m:t>14·27+</m:t>
               </m:r>
               <m:r>
                 <w:rPr>
@@ -10157,7 +10376,7 @@
                 <w:rPr>
                   <w:rFonts w:ascii="Cambria Math" w:hAnsi="Cambria Math"/>
                 </w:rPr>
-                <m:t>≡12</m:t>
+                <m:t>≡7</m:t>
               </m:r>
               <m:r>
                 <m:rPr>
@@ -10235,7 +10454,7 @@
                 <w:rPr>
                   <w:rFonts w:ascii="Cambria Math" w:hAnsi="Cambria Math"/>
                 </w:rPr>
-                <m:t>135+</m:t>
+                <m:t>378+</m:t>
               </m:r>
               <m:r>
                 <w:rPr>
@@ -10250,7 +10469,7 @@
                 <w:rPr>
                   <w:rFonts w:ascii="Cambria Math" w:hAnsi="Cambria Math"/>
                 </w:rPr>
-                <m:t>≡12</m:t>
+                <m:t>≡7</m:t>
               </m:r>
               <m:r>
                 <m:rPr>
@@ -10328,7 +10547,7 @@
                 <w:rPr>
                   <w:rFonts w:ascii="Cambria Math" w:hAnsi="Cambria Math"/>
                 </w:rPr>
-                <m:t>7+</m:t>
+                <m:t>26+</m:t>
               </m:r>
               <m:r>
                 <w:rPr>
@@ -10343,7 +10562,7 @@
                 <w:rPr>
                   <w:rFonts w:ascii="Cambria Math" w:hAnsi="Cambria Math"/>
                 </w:rPr>
-                <m:t>≡12</m:t>
+                <m:t>≡7</m:t>
               </m:r>
               <m:r>
                 <m:rPr>
@@ -10427,7 +10646,7 @@
                 <w:rPr>
                   <w:rFonts w:ascii="Cambria Math" w:hAnsi="Cambria Math"/>
                 </w:rPr>
-                <m:t>≡5</m:t>
+                <m:t>≡7-26=-19≡13</m:t>
               </m:r>
               <m:r>
                 <m:rPr>
@@ -10502,10 +10721,139 @@
         <w:jc w:val="both"/>
       </w:pPr>
       <w:r>
-        <w:rPr>
-          <w:i/>
-        </w:rPr>
-        <w:t xml:space="preserve">(Подстановка в первое уравнение системы: </w:t>
+        <w:t>Проверка по второму уравнению:</w:t>
+      </w:r>
+    </w:p>
+    <w:p>
+      <w:pPr>
+        <w:spacing w:before="120" w:after="120"/>
+        <w:ind w:firstLine="0"/>
+        <w:jc w:val="center"/>
+      </w:pPr>
+      <m:oMathPara>
+        <m:oMath>
+          <m:box>
+            <m:boxPr>
+              <m:ctrlPr>
+                <w:rPr>
+                  <w:rFonts w:ascii="Cambria Math" w:hAnsi="Cambria Math"/>
+                </w:rPr>
+              </m:ctrlPr>
+            </m:boxPr>
+            <m:e>
+              <m:r>
+                <m:rPr>
+                  <m:sty m:val="p"/>
+                </m:rPr>
+                <w:rPr>
+                  <w:rFonts w:ascii="Cambria Math" w:hAnsi="Cambria Math"/>
+                </w:rPr>
+                <m:t>13·27+13=351+13=364=11·32+12≡12</m:t>
+              </m:r>
+              <m:r>
+                <m:rPr>
+                  <m:nor/>
+                </m:rPr>
+                <m:t>   </m:t>
+              </m:r>
+              <m:d>
+                <m:dPr>
+                  <m:ctrlPr>
+                    <w:rPr>
+                      <w:rFonts w:ascii="Cambria Math" w:hAnsi="Cambria Math"/>
+                    </w:rPr>
+                  </m:ctrlPr>
+                </m:dPr>
+                <m:e>
+                  <m:box>
+                    <m:boxPr>
+                      <m:ctrlPr>
+                        <w:rPr>
+                          <w:rFonts w:ascii="Cambria Math" w:hAnsi="Cambria Math"/>
+                        </w:rPr>
+                      </m:ctrlPr>
+                    </m:boxPr>
+                    <m:e>
+                      <m:r>
+                        <m:rPr>
+                          <m:sty m:val="p"/>
+                        </m:rPr>
+                        <w:rPr>
+                          <w:rFonts w:ascii="Cambria Math" w:hAnsi="Cambria Math"/>
+                        </w:rPr>
+                        <m:t>mod</m:t>
+                      </m:r>
+                      <m:r>
+                        <m:rPr>
+                          <m:nor/>
+                        </m:rPr>
+                        <m:t> </m:t>
+                      </m:r>
+                      <m:box>
+                        <m:boxPr>
+                          <m:ctrlPr>
+                            <w:rPr>
+                              <w:rFonts w:ascii="Cambria Math" w:hAnsi="Cambria Math"/>
+                            </w:rPr>
+                          </m:ctrlPr>
+                        </m:boxPr>
+                        <m:e>
+                          <m:r>
+                            <m:rPr>
+                              <m:sty m:val="p"/>
+                            </m:rPr>
+                            <w:rPr>
+                              <w:rFonts w:ascii="Cambria Math" w:hAnsi="Cambria Math"/>
+                            </w:rPr>
+                            <m:t>32</m:t>
+                          </m:r>
+                        </m:e>
+                      </m:box>
+                    </m:e>
+                  </m:box>
+                </m:e>
+              </m:d>
+              <m:r>
+                <m:rPr>
+                  <m:nor/>
+                </m:rPr>
+                <m:t>   </m:t>
+              </m:r>
+              <m:r>
+                <m:rPr>
+                  <m:sty m:val="p"/>
+                </m:rPr>
+                <w:rPr>
+                  <w:rFonts w:ascii="Cambria Math" w:hAnsi="Cambria Math"/>
+                </w:rPr>
+                <m:t>(</m:t>
+              </m:r>
+              <m:r>
+                <m:rPr>
+                  <m:nor/>
+                </m:rPr>
+                <m:t>верно</m:t>
+              </m:r>
+              <m:r>
+                <m:rPr>
+                  <m:sty m:val="p"/>
+                </m:rPr>
+                <w:rPr>
+                  <w:rFonts w:ascii="Cambria Math" w:hAnsi="Cambria Math"/>
+                </w:rPr>
+                <m:t>)</m:t>
+              </m:r>
+            </m:e>
+          </m:box>
+        </m:oMath>
+      </m:oMathPara>
+    </w:p>
+    <w:p>
+      <w:pPr>
+        <w:jc w:val="both"/>
+      </w:pPr>
+      <w:r>
+        <w:t xml:space="preserve">Найден ключ: </w:t>
       </w:r>
       <m:oMath>
         <m:box>
@@ -10518,13 +10866,25 @@
           </m:boxPr>
           <m:e>
             <m:r>
+              <w:rPr>
+                <w:rFonts w:ascii="Cambria Math" w:hAnsi="Cambria Math"/>
+              </w:rPr>
+              <m:t>a</m:t>
+            </m:r>
+            <m:r>
               <m:rPr>
                 <m:sty m:val="p"/>
               </m:rPr>
               <w:rPr>
                 <w:rFonts w:ascii="Cambria Math" w:hAnsi="Cambria Math"/>
               </w:rPr>
-              <m:t>14·27+</m:t>
+              <m:t>=27,</m:t>
+            </m:r>
+            <m:r>
+              <m:rPr>
+                <m:nor/>
+              </m:rPr>
+              <m:t> </m:t>
             </m:r>
             <m:r>
               <w:rPr>
@@ -10539,351 +10899,12 @@
               <w:rPr>
                 <w:rFonts w:ascii="Cambria Math" w:hAnsi="Cambria Math"/>
               </w:rPr>
-              <m:t>≡7</m:t>
-            </m:r>
-            <m:r>
-              <m:rPr>
-                <m:nor/>
-              </m:rPr>
-              <m:t>   </m:t>
-            </m:r>
-            <m:d>
-              <m:dPr>
-                <m:ctrlPr>
-                  <w:rPr>
-                    <w:rFonts w:ascii="Cambria Math" w:hAnsi="Cambria Math"/>
-                  </w:rPr>
-                </m:ctrlPr>
-              </m:dPr>
-              <m:e>
-                <m:box>
-                  <m:boxPr>
-                    <m:ctrlPr>
-                      <w:rPr>
-                        <w:rFonts w:ascii="Cambria Math" w:hAnsi="Cambria Math"/>
-                      </w:rPr>
-                    </m:ctrlPr>
-                  </m:boxPr>
-                  <m:e>
-                    <m:r>
-                      <m:rPr>
-                        <m:sty m:val="p"/>
-                      </m:rPr>
-                      <w:rPr>
-                        <w:rFonts w:ascii="Cambria Math" w:hAnsi="Cambria Math"/>
-                      </w:rPr>
-                      <m:t>mod</m:t>
-                    </m:r>
-                    <m:r>
-                      <m:rPr>
-                        <m:nor/>
-                      </m:rPr>
-                      <m:t> </m:t>
-                    </m:r>
-                    <m:box>
-                      <m:boxPr>
-                        <m:ctrlPr>
-                          <w:rPr>
-                            <w:rFonts w:ascii="Cambria Math" w:hAnsi="Cambria Math"/>
-                          </w:rPr>
-                        </m:ctrlPr>
-                      </m:boxPr>
-                      <m:e>
-                        <m:r>
-                          <m:rPr>
-                            <m:sty m:val="p"/>
-                          </m:rPr>
-                          <w:rPr>
-                            <w:rFonts w:ascii="Cambria Math" w:hAnsi="Cambria Math"/>
-                          </w:rPr>
-                          <m:t>32</m:t>
-                        </m:r>
-                      </m:e>
-                    </m:box>
-                  </m:e>
-                </m:box>
-              </m:e>
-            </m:d>
-            <m:r>
-              <w:rPr>
-                <w:rFonts w:ascii="Cambria Math" w:hAnsi="Cambria Math"/>
-              </w:rPr>
-              <m:t>⟹</m:t>
-            </m:r>
-            <m:r>
-              <m:rPr>
-                <m:sty m:val="p"/>
-              </m:rPr>
-              <w:rPr>
-                <w:rFonts w:ascii="Cambria Math" w:hAnsi="Cambria Math"/>
-              </w:rPr>
-              <m:t>378+</m:t>
-            </m:r>
-            <m:r>
-              <w:rPr>
-                <w:rFonts w:ascii="Cambria Math" w:hAnsi="Cambria Math"/>
-              </w:rPr>
-              <m:t>b</m:t>
-            </m:r>
-            <m:r>
-              <m:rPr>
-                <m:sty m:val="p"/>
-              </m:rPr>
-              <w:rPr>
-                <w:rFonts w:ascii="Cambria Math" w:hAnsi="Cambria Math"/>
-              </w:rPr>
-              <m:t>≡7</m:t>
-            </m:r>
-            <m:r>
-              <m:rPr>
-                <m:nor/>
-              </m:rPr>
-              <m:t>   </m:t>
-            </m:r>
-            <m:d>
-              <m:dPr>
-                <m:ctrlPr>
-                  <w:rPr>
-                    <w:rFonts w:ascii="Cambria Math" w:hAnsi="Cambria Math"/>
-                  </w:rPr>
-                </m:ctrlPr>
-              </m:dPr>
-              <m:e>
-                <m:box>
-                  <m:boxPr>
-                    <m:ctrlPr>
-                      <w:rPr>
-                        <w:rFonts w:ascii="Cambria Math" w:hAnsi="Cambria Math"/>
-                      </w:rPr>
-                    </m:ctrlPr>
-                  </m:boxPr>
-                  <m:e>
-                    <m:r>
-                      <m:rPr>
-                        <m:sty m:val="p"/>
-                      </m:rPr>
-                      <w:rPr>
-                        <w:rFonts w:ascii="Cambria Math" w:hAnsi="Cambria Math"/>
-                      </w:rPr>
-                      <m:t>mod</m:t>
-                    </m:r>
-                    <m:r>
-                      <m:rPr>
-                        <m:nor/>
-                      </m:rPr>
-                      <m:t> </m:t>
-                    </m:r>
-                    <m:box>
-                      <m:boxPr>
-                        <m:ctrlPr>
-                          <w:rPr>
-                            <w:rFonts w:ascii="Cambria Math" w:hAnsi="Cambria Math"/>
-                          </w:rPr>
-                        </m:ctrlPr>
-                      </m:boxPr>
-                      <m:e>
-                        <m:r>
-                          <m:rPr>
-                            <m:sty m:val="p"/>
-                          </m:rPr>
-                          <w:rPr>
-                            <w:rFonts w:ascii="Cambria Math" w:hAnsi="Cambria Math"/>
-                          </w:rPr>
-                          <m:t>32</m:t>
-                        </m:r>
-                      </m:e>
-                    </m:box>
-                  </m:e>
-                </m:box>
-              </m:e>
-            </m:d>
-            <m:r>
-              <w:rPr>
-                <w:rFonts w:ascii="Cambria Math" w:hAnsi="Cambria Math"/>
-              </w:rPr>
-              <m:t>⟹</m:t>
-            </m:r>
-            <m:r>
-              <m:rPr>
-                <m:sty m:val="p"/>
-              </m:rPr>
-              <w:rPr>
-                <w:rFonts w:ascii="Cambria Math" w:hAnsi="Cambria Math"/>
-              </w:rPr>
-              <m:t>26+</m:t>
-            </m:r>
-            <m:r>
-              <w:rPr>
-                <w:rFonts w:ascii="Cambria Math" w:hAnsi="Cambria Math"/>
-              </w:rPr>
-              <m:t>b</m:t>
-            </m:r>
-            <m:r>
-              <m:rPr>
-                <m:sty m:val="p"/>
-              </m:rPr>
-              <w:rPr>
-                <w:rFonts w:ascii="Cambria Math" w:hAnsi="Cambria Math"/>
-              </w:rPr>
-              <m:t>≡7</m:t>
-            </m:r>
-            <m:r>
-              <m:rPr>
-                <m:nor/>
-              </m:rPr>
-              <m:t>   </m:t>
-            </m:r>
-            <m:d>
-              <m:dPr>
-                <m:ctrlPr>
-                  <w:rPr>
-                    <w:rFonts w:ascii="Cambria Math" w:hAnsi="Cambria Math"/>
-                  </w:rPr>
-                </m:ctrlPr>
-              </m:dPr>
-              <m:e>
-                <m:box>
-                  <m:boxPr>
-                    <m:ctrlPr>
-                      <w:rPr>
-                        <w:rFonts w:ascii="Cambria Math" w:hAnsi="Cambria Math"/>
-                      </w:rPr>
-                    </m:ctrlPr>
-                  </m:boxPr>
-                  <m:e>
-                    <m:r>
-                      <m:rPr>
-                        <m:sty m:val="p"/>
-                      </m:rPr>
-                      <w:rPr>
-                        <w:rFonts w:ascii="Cambria Math" w:hAnsi="Cambria Math"/>
-                      </w:rPr>
-                      <m:t>mod</m:t>
-                    </m:r>
-                    <m:r>
-                      <m:rPr>
-                        <m:nor/>
-                      </m:rPr>
-                      <m:t> </m:t>
-                    </m:r>
-                    <m:box>
-                      <m:boxPr>
-                        <m:ctrlPr>
-                          <w:rPr>
-                            <w:rFonts w:ascii="Cambria Math" w:hAnsi="Cambria Math"/>
-                          </w:rPr>
-                        </m:ctrlPr>
-                      </m:boxPr>
-                      <m:e>
-                        <m:r>
-                          <m:rPr>
-                            <m:sty m:val="p"/>
-                          </m:rPr>
-                          <w:rPr>
-                            <w:rFonts w:ascii="Cambria Math" w:hAnsi="Cambria Math"/>
-                          </w:rPr>
-                          <m:t>32</m:t>
-                        </m:r>
-                      </m:e>
-                    </m:box>
-                  </m:e>
-                </m:box>
-              </m:e>
-            </m:d>
-            <m:r>
-              <w:rPr>
-                <w:rFonts w:ascii="Cambria Math" w:hAnsi="Cambria Math"/>
-              </w:rPr>
-              <m:t>⟹</m:t>
-            </m:r>
-            <m:r>
-              <w:rPr>
-                <w:rFonts w:ascii="Cambria Math" w:hAnsi="Cambria Math"/>
-              </w:rPr>
-              <m:t>b</m:t>
-            </m:r>
-            <m:r>
-              <m:rPr>
-                <m:sty m:val="p"/>
-              </m:rPr>
-              <w:rPr>
-                <w:rFonts w:ascii="Cambria Math" w:hAnsi="Cambria Math"/>
-              </w:rPr>
-              <m:t>≡13</m:t>
-            </m:r>
-            <m:r>
-              <m:rPr>
-                <m:nor/>
-              </m:rPr>
-              <m:t>   </m:t>
-            </m:r>
-            <m:d>
-              <m:dPr>
-                <m:ctrlPr>
-                  <w:rPr>
-                    <w:rFonts w:ascii="Cambria Math" w:hAnsi="Cambria Math"/>
-                  </w:rPr>
-                </m:ctrlPr>
-              </m:dPr>
-              <m:e>
-                <m:box>
-                  <m:boxPr>
-                    <m:ctrlPr>
-                      <w:rPr>
-                        <w:rFonts w:ascii="Cambria Math" w:hAnsi="Cambria Math"/>
-                      </w:rPr>
-                    </m:ctrlPr>
-                  </m:boxPr>
-                  <m:e>
-                    <m:r>
-                      <m:rPr>
-                        <m:sty m:val="p"/>
-                      </m:rPr>
-                      <w:rPr>
-                        <w:rFonts w:ascii="Cambria Math" w:hAnsi="Cambria Math"/>
-                      </w:rPr>
-                      <m:t>mod</m:t>
-                    </m:r>
-                    <m:r>
-                      <m:rPr>
-                        <m:nor/>
-                      </m:rPr>
-                      <m:t> </m:t>
-                    </m:r>
-                    <m:box>
-                      <m:boxPr>
-                        <m:ctrlPr>
-                          <w:rPr>
-                            <w:rFonts w:ascii="Cambria Math" w:hAnsi="Cambria Math"/>
-                          </w:rPr>
-                        </m:ctrlPr>
-                      </m:boxPr>
-                      <m:e>
-                        <m:r>
-                          <m:rPr>
-                            <m:sty m:val="p"/>
-                          </m:rPr>
-                          <w:rPr>
-                            <w:rFonts w:ascii="Cambria Math" w:hAnsi="Cambria Math"/>
-                          </w:rPr>
-                          <m:t>32</m:t>
-                        </m:r>
-                      </m:e>
-                    </m:box>
-                  </m:e>
-                </m:box>
-              </m:e>
-            </m:d>
+              <m:t>=13</m:t>
+            </m:r>
           </m:e>
         </m:box>
       </m:oMath>
       <w:r>
-        <w:rPr>
-          <w:i/>
-        </w:rPr>
-        <w:t xml:space="preserve"> при проверке соответствия по модулю)</w:t>
-      </w:r>
-      <w:r>
         <w:t>.</w:t>
       </w:r>
     </w:p>
@@ -10893,7 +10914,13 @@
         <w:jc w:val="both"/>
       </w:pPr>
       <w:r>
-        <w:t xml:space="preserve">2. Анализ несовместной системы для гипотезы </w:t>
+        <w:t xml:space="preserve">4. </w:t>
+      </w:r>
+      <w:r>
+        <w:rPr>
+          <w:b/>
+        </w:rPr>
+        <w:t xml:space="preserve">Демонстрация несовместной системы (для гипотезы </w:t>
       </w:r>
       <m:oMath>
         <m:box>
@@ -10941,22 +10968,15 @@
               </m:rPr>
               <m:t>'з'</m:t>
             </m:r>
-          </m:e>
-        </m:box>
-      </m:oMath>
-      <w:r>
-        <w:t xml:space="preserve">, </w:t>
-      </w:r>
-      <m:oMath>
-        <m:box>
-          <m:boxPr>
-            <m:ctrlPr>
-              <w:rPr>
-                <w:rFonts w:ascii="Cambria Math" w:hAnsi="Cambria Math"/>
-              </w:rPr>
-            </m:ctrlPr>
-          </m:boxPr>
-          <m:e>
+            <m:r>
+              <m:rPr>
+                <m:sty m:val="p"/>
+              </m:rPr>
+              <w:rPr>
+                <w:rFonts w:ascii="Cambria Math" w:hAnsi="Cambria Math"/>
+              </w:rPr>
+              <m:t>,</m:t>
+            </m:r>
             <m:r>
               <w:rPr>
                 <w:rFonts w:ascii="Cambria Math" w:hAnsi="Cambria Math"/>
@@ -10997,7 +11017,10 @@
         </m:box>
       </m:oMath>
       <w:r>
-        <w:t>:</w:t>
+        <w:rPr>
+          <w:b/>
+        </w:rPr>
+        <w:t>):</w:t>
       </w:r>
     </w:p>
     <w:p>
@@ -11171,16 +11194,7 @@
                 <w:rPr>
                   <w:rFonts w:ascii="Cambria Math" w:hAnsi="Cambria Math"/>
                 </w:rPr>
-                <m:t>≡7-12≡-5≡</m:t>
-              </m:r>
-              <m:r>
-                <m:rPr>
-                  <m:sty m:val="p"/>
-                </m:rPr>
-                <w:rPr>
-                  <w:rFonts w:ascii="Cambria Math" w:hAnsi="Cambria Math"/>
-                </w:rPr>
-                <m:t>27</m:t>
+                <m:t>≡7-12≡-5≡27</m:t>
               </m:r>
               <m:r>
                 <m:rPr>
@@ -11575,7 +11589,7 @@
                 <w:rPr>
                   <w:rFonts w:ascii="Cambria Math" w:hAnsi="Cambria Math"/>
                 </w:rPr>
-                <m:t>1=5-2·2=5-2·(27-5·5)=11·5-2·27=11·(32-</m:t>
+                <m:t>1=5-2·2=5-2·(27-5·5)=11·5-2·27=11·(32-27)-2·27=11·</m:t>
               </m:r>
               <m:r>
                 <m:rPr>
@@ -11584,7 +11598,7 @@
                 <w:rPr>
                   <w:rFonts w:ascii="Cambria Math" w:hAnsi="Cambria Math"/>
                 </w:rPr>
-                <m:t>27)-2·27=11·32-13·27</m:t>
+                <m:t>32-13·27</m:t>
               </m:r>
             </m:e>
           </m:box>
@@ -11596,7 +11610,6 @@
         <w:jc w:val="both"/>
       </w:pPr>
       <w:r>
-        <w:lastRenderedPageBreak/>
         <w:t xml:space="preserve">Тождество Безу: </w:t>
       </w:r>
       <m:oMath>
@@ -11797,6 +11810,7 @@
         <w:jc w:val="both"/>
       </w:pPr>
       <w:r>
+        <w:lastRenderedPageBreak/>
         <w:t>Обратное преобразование расшифрования:</w:t>
       </w:r>
     </w:p>
@@ -11998,7 +12012,7 @@
       <w:pPr>
         <w:pStyle w:val="21"/>
       </w:pPr>
-      <w:bookmarkStart w:id="4" w:name="_Toc241668684"/>
+      <w:bookmarkStart w:id="4" w:name="_Toc241671330"/>
       <w:r>
         <w:rPr>
           <w:rFonts w:ascii="Times New Roman" w:eastAsia="Times New Roman" w:hAnsi="Times New Roman" w:cs="Times New Roman"/>
@@ -12174,7 +12188,6 @@
           <w:rFonts w:ascii="DejaVu Sans" w:eastAsia="DejaVu Sans" w:hAnsi="DejaVu Sans" w:cs="DejaVu Sans"/>
           <w:sz w:val="22"/>
         </w:rPr>
-        <w:lastRenderedPageBreak/>
         <w:t xml:space="preserve">    """Расширенный алгоритм Евклида: d = gcd(a,b), a*u + b*v = d."""</w:t>
       </w:r>
     </w:p>
@@ -12259,6 +12272,7 @@
           <w:rFonts w:ascii="DejaVu Sans" w:eastAsia="DejaVu Sans" w:hAnsi="DejaVu Sans" w:cs="DejaVu Sans"/>
           <w:sz w:val="22"/>
         </w:rPr>
+        <w:lastRenderedPageBreak/>
         <w:t xml:space="preserve">    r0, r1 = a, b</w:t>
       </w:r>
     </w:p>
@@ -12708,7 +12722,6 @@
           <w:rFonts w:ascii="DejaVu Sans" w:eastAsia="DejaVu Sans" w:hAnsi="DejaVu Sans" w:cs="DejaVu Sans"/>
           <w:sz w:val="22"/>
         </w:rPr>
-        <w:lastRenderedPageBreak/>
         <w:t xml:space="preserve">    if b_mod % d != 0:</w:t>
       </w:r>
     </w:p>
@@ -12786,6 +12799,7 @@
           <w:rFonts w:ascii="DejaVu Sans" w:eastAsia="DejaVu Sans" w:hAnsi="DejaVu Sans" w:cs="DejaVu Sans"/>
           <w:sz w:val="22"/>
         </w:rPr>
+        <w:lastRenderedPageBreak/>
         <w:t xml:space="preserve">    _, u_prime, _ = extended_gcd(a_prime, m_prime)</w:t>
       </w:r>
     </w:p>
@@ -13261,7 +13275,6 @@
           <w:rFonts w:ascii="DejaVu Sans" w:eastAsia="DejaVu Sans" w:hAnsi="DejaVu Sans" w:cs="DejaVu Sans"/>
           <w:sz w:val="22"/>
         </w:rPr>
-        <w:lastRenderedPageBreak/>
         <w:t xml:space="preserve">            raise ValueError(f"Коэффициент a={a} необратим по модулю m={self.power} (НОД={gcd_val} ≠ 1)")</w:t>
       </w:r>
     </w:p>
@@ -13339,6 +13352,7 @@
           <w:rFonts w:ascii="DejaVu Sans" w:eastAsia="DejaVu Sans" w:hAnsi="DejaVu Sans" w:cs="DejaVu Sans"/>
           <w:sz w:val="22"/>
         </w:rPr>
+        <w:lastRenderedPageBreak/>
         <w:t xml:space="preserve">        is_inv, _, a_inv, _ = mod_inverse(a, self.power)</w:t>
       </w:r>
     </w:p>
@@ -13902,6 +13916,7 @@
           <w:rFonts w:ascii="DejaVu Sans" w:eastAsia="DejaVu Sans" w:hAnsi="DejaVu Sans" w:cs="DejaVu Sans"/>
           <w:sz w:val="22"/>
         </w:rPr>
+        <w:lastRenderedPageBreak/>
         <w:t xml:space="preserve">        return results</w:t>
       </w:r>
     </w:p>
@@ -14393,7 +14408,6 @@
           <w:rFonts w:ascii="DejaVu Sans" w:eastAsia="DejaVu Sans" w:hAnsi="DejaVu Sans" w:cs="DejaVu Sans"/>
           <w:sz w:val="22"/>
         </w:rPr>
-        <w:lastRenderedPageBreak/>
         <w:t xml:space="preserve">        "total_alpha_chars": total</w:t>
       </w:r>
     </w:p>
@@ -14471,6 +14485,7 @@
           <w:rFonts w:ascii="DejaVu Sans" w:eastAsia="DejaVu Sans" w:hAnsi="DejaVu Sans" w:cs="DejaVu Sans"/>
           <w:sz w:val="22"/>
         </w:rPr>
+        <w:lastRenderedPageBreak/>
         <w:t xml:space="preserve">    fa = frequency_analysis(ciphertext, alpha)</w:t>
       </w:r>
     </w:p>
@@ -14969,7 +14984,6 @@
           <w:rFonts w:ascii="DejaVu Sans" w:eastAsia="DejaVu Sans" w:hAnsi="DejaVu Sans" w:cs="DejaVu Sans"/>
           <w:sz w:val="22"/>
         </w:rPr>
-        <w:lastRenderedPageBreak/>
         <w:t xml:space="preserve">    hypotheses = generate_hypotheses_systems(ciphertext, alpha)</w:t>
       </w:r>
     </w:p>
@@ -15074,6 +15088,7 @@
           <w:rFonts w:ascii="DejaVu Sans" w:eastAsia="DejaVu Sans" w:hAnsi="DejaVu Sans" w:cs="DejaVu Sans"/>
           <w:sz w:val="22"/>
         </w:rPr>
+        <w:lastRenderedPageBreak/>
         <w:t xml:space="preserve">            score = score_russian_text(dec_text)</w:t>
       </w:r>
     </w:p>
@@ -15121,7 +15136,7 @@
         <w:pStyle w:val="1"/>
         <w:pageBreakBefore/>
       </w:pPr>
-      <w:bookmarkStart w:id="5" w:name="_Toc241668685"/>
+      <w:bookmarkStart w:id="5" w:name="_Toc241671331"/>
       <w:r>
         <w:rPr>
           <w:rFonts w:ascii="Times New Roman" w:eastAsia="Times New Roman" w:hAnsi="Times New Roman" w:cs="Times New Roman"/>
@@ -15359,7 +15374,7 @@
         <w:pStyle w:val="1"/>
         <w:pageBreakBefore/>
       </w:pPr>
-      <w:bookmarkStart w:id="6" w:name="_Toc241668686"/>
+      <w:bookmarkStart w:id="6" w:name="_Toc241671332"/>
       <w:r>
         <w:rPr>
           <w:rFonts w:ascii="Times New Roman" w:eastAsia="Times New Roman" w:hAnsi="Times New Roman" w:cs="Times New Roman"/>
@@ -15763,31 +15778,31 @@
       </w:rPr>
     </w:lvl>
   </w:abstractNum>
-  <w:num w:numId="1" w16cid:durableId="705376824">
+  <w:num w:numId="1" w16cid:durableId="2131585209">
     <w:abstractNumId w:val="8"/>
   </w:num>
-  <w:num w:numId="2" w16cid:durableId="514656414">
+  <w:num w:numId="2" w16cid:durableId="667170224">
     <w:abstractNumId w:val="6"/>
   </w:num>
-  <w:num w:numId="3" w16cid:durableId="668143065">
+  <w:num w:numId="3" w16cid:durableId="530148588">
     <w:abstractNumId w:val="5"/>
   </w:num>
-  <w:num w:numId="4" w16cid:durableId="632056324">
+  <w:num w:numId="4" w16cid:durableId="998731101">
     <w:abstractNumId w:val="4"/>
   </w:num>
-  <w:num w:numId="5" w16cid:durableId="1010331404">
+  <w:num w:numId="5" w16cid:durableId="1863468488">
     <w:abstractNumId w:val="7"/>
   </w:num>
-  <w:num w:numId="6" w16cid:durableId="1045180552">
+  <w:num w:numId="6" w16cid:durableId="2075543390">
     <w:abstractNumId w:val="3"/>
   </w:num>
-  <w:num w:numId="7" w16cid:durableId="117994756">
+  <w:num w:numId="7" w16cid:durableId="36979559">
     <w:abstractNumId w:val="2"/>
   </w:num>
-  <w:num w:numId="8" w16cid:durableId="1039747796">
+  <w:num w:numId="8" w16cid:durableId="607666486">
     <w:abstractNumId w:val="1"/>
   </w:num>
-  <w:num w:numId="9" w16cid:durableId="1470050201">
+  <w:num w:numId="9" w16cid:durableId="994604167">
     <w:abstractNumId w:val="0"/>
   </w:num>
 </w:numbering>
@@ -27225,7 +27240,7 @@
     <w:autoRedefine/>
     <w:uiPriority w:val="39"/>
     <w:unhideWhenUsed/>
-    <w:rsid w:val="00BD5EF6"/>
+    <w:rsid w:val="00DE49A9"/>
     <w:pPr>
       <w:spacing w:after="100"/>
     </w:pPr>
@@ -27237,7 +27252,7 @@
     <w:autoRedefine/>
     <w:uiPriority w:val="39"/>
     <w:unhideWhenUsed/>
-    <w:rsid w:val="00BD5EF6"/>
+    <w:rsid w:val="00DE49A9"/>
     <w:pPr>
       <w:spacing w:after="100"/>
       <w:ind w:left="280"/>
@@ -27248,7 +27263,7 @@
     <w:basedOn w:val="a2"/>
     <w:uiPriority w:val="99"/>
     <w:unhideWhenUsed/>
-    <w:rsid w:val="00BD5EF6"/>
+    <w:rsid w:val="00DE49A9"/>
     <w:rPr>
       <w:color w:val="0000FF" w:themeColor="hyperlink"/>
       <w:u w:val="single"/>

</xml_diff>